<commit_message>
Added OpenAPI Swagger and PDF Sanitization feature
</commit_message>
<xml_diff>
--- a/Инструкция по запуску.docx
+++ b/Инструкция по запуску.docx
@@ -39,14 +39,12 @@
         <w:rPr>
           <w:sz w:val="24"/>
           <w:szCs w:val="24"/>
-          <w:lang w:val="ru-KZ"/>
-        </w:rPr>
-      </w:pPr>
-      <w:r>
-        <w:rPr>
-          <w:sz w:val="24"/>
-          <w:szCs w:val="24"/>
-          <w:lang w:val="ru-KZ"/>
+        </w:rPr>
+      </w:pPr>
+      <w:r>
+        <w:rPr>
+          <w:sz w:val="24"/>
+          <w:szCs w:val="24"/>
         </w:rPr>
         <w:t>Данный сервис представляет собой REST API, для автоматического анализа загружаемых PDF</w:t>
       </w:r>
@@ -54,7 +52,6 @@
         <w:rPr>
           <w:sz w:val="24"/>
           <w:szCs w:val="24"/>
-          <w:lang w:val="ru-KZ"/>
         </w:rPr>
         <w:t xml:space="preserve"> файлов</w:t>
       </w:r>
@@ -62,7 +59,6 @@
         <w:rPr>
           <w:sz w:val="24"/>
           <w:szCs w:val="24"/>
-          <w:lang w:val="ru-KZ"/>
         </w:rPr>
         <w:t xml:space="preserve"> на наличие потенциально опасных объектов</w:t>
       </w:r>
@@ -70,7 +66,6 @@
         <w:rPr>
           <w:sz w:val="24"/>
           <w:szCs w:val="24"/>
-          <w:lang w:val="ru-KZ"/>
         </w:rPr>
         <w:t xml:space="preserve"> и </w:t>
       </w:r>
@@ -78,7 +73,6 @@
         <w:rPr>
           <w:sz w:val="24"/>
           <w:szCs w:val="24"/>
-          <w:lang w:val="ru-KZ"/>
         </w:rPr>
         <w:t>скрытых инъекций</w:t>
       </w:r>
@@ -86,7 +80,6 @@
         <w:rPr>
           <w:sz w:val="24"/>
           <w:szCs w:val="24"/>
-          <w:lang w:val="ru-KZ"/>
         </w:rPr>
         <w:t xml:space="preserve">. </w:t>
       </w:r>
@@ -117,14 +110,12 @@
         <w:rPr>
           <w:sz w:val="24"/>
           <w:szCs w:val="24"/>
-          <w:lang w:val="ru-KZ"/>
-        </w:rPr>
-      </w:pPr>
-      <w:r>
-        <w:rPr>
-          <w:sz w:val="24"/>
-          <w:szCs w:val="24"/>
-          <w:lang w:val="ru-KZ"/>
+        </w:rPr>
+      </w:pPr>
+      <w:r>
+        <w:rPr>
+          <w:sz w:val="24"/>
+          <w:szCs w:val="24"/>
         </w:rPr>
         <w:t>Перейдите в папку с исходным кодом проекта.</w:t>
       </w:r>
@@ -139,7 +130,6 @@
         <w:rPr>
           <w:sz w:val="24"/>
           <w:szCs w:val="24"/>
-          <w:lang w:val="ru-KZ"/>
         </w:rPr>
       </w:pPr>
       <w:r>
@@ -165,7 +155,6 @@
           <w:rFonts w:cstheme="minorHAnsi"/>
           <w:sz w:val="28"/>
           <w:szCs w:val="28"/>
-          <w:lang w:val="ru-KZ"/>
         </w:rPr>
       </w:pPr>
       <w:proofErr w:type="spellStart"/>
@@ -173,7 +162,7 @@
         <w:rPr>
           <w:rFonts w:eastAsia="Times New Roman" w:cstheme="minorHAnsi"/>
           <w:kern w:val="0"/>
-          <w:lang w:val="ru-KZ" w:eastAsia="ru-KZ"/>
+          <w:lang w:eastAsia="ru-KZ"/>
           <w14:ligatures w14:val="none"/>
         </w:rPr>
         <w:t>docker</w:t>
@@ -183,7 +172,7 @@
         <w:rPr>
           <w:rFonts w:eastAsia="Times New Roman" w:cstheme="minorHAnsi"/>
           <w:kern w:val="0"/>
-          <w:lang w:val="ru-KZ" w:eastAsia="ru-KZ"/>
+          <w:lang w:eastAsia="ru-KZ"/>
           <w14:ligatures w14:val="none"/>
         </w:rPr>
         <w:t xml:space="preserve"> </w:t>
@@ -193,7 +182,7 @@
         <w:rPr>
           <w:rFonts w:eastAsia="Times New Roman" w:cstheme="minorHAnsi"/>
           <w:kern w:val="0"/>
-          <w:lang w:val="ru-KZ" w:eastAsia="ru-KZ"/>
+          <w:lang w:eastAsia="ru-KZ"/>
           <w14:ligatures w14:val="none"/>
         </w:rPr>
         <w:t>build</w:t>
@@ -203,7 +192,7 @@
         <w:rPr>
           <w:rFonts w:eastAsia="Times New Roman" w:cstheme="minorHAnsi"/>
           <w:kern w:val="0"/>
-          <w:lang w:val="ru-KZ" w:eastAsia="ru-KZ"/>
+          <w:lang w:eastAsia="ru-KZ"/>
           <w14:ligatures w14:val="none"/>
         </w:rPr>
         <w:t xml:space="preserve"> -t </w:t>
@@ -213,7 +202,7 @@
         <w:rPr>
           <w:rFonts w:eastAsia="Times New Roman" w:cstheme="minorHAnsi"/>
           <w:kern w:val="0"/>
-          <w:lang w:val="ru-KZ" w:eastAsia="ru-KZ"/>
+          <w:lang w:eastAsia="ru-KZ"/>
           <w14:ligatures w14:val="none"/>
         </w:rPr>
         <w:t>pdf-check-service</w:t>
@@ -223,7 +212,7 @@
         <w:rPr>
           <w:rFonts w:eastAsia="Times New Roman" w:cstheme="minorHAnsi"/>
           <w:kern w:val="0"/>
-          <w:lang w:val="ru-KZ" w:eastAsia="ru-KZ"/>
+          <w:lang w:eastAsia="ru-KZ"/>
           <w14:ligatures w14:val="none"/>
         </w:rPr>
         <w:t xml:space="preserve"> .</w:t>
@@ -239,7 +228,6 @@
         <w:rPr>
           <w:sz w:val="24"/>
           <w:szCs w:val="24"/>
-          <w:lang w:val="ru-KZ"/>
         </w:rPr>
       </w:pPr>
       <w:r>
@@ -256,7 +244,7 @@
         <w:rPr>
           <w:sz w:val="24"/>
           <w:szCs w:val="24"/>
-          <w:lang w:val="ru-RU"/>
+          <w:lang w:val="en-US"/>
         </w:rPr>
       </w:pPr>
       <w:proofErr w:type="spellStart"/>
@@ -366,28 +354,162 @@
     </w:p>
     <w:p>
       <w:pPr>
-        <w:rPr>
+        <w:pStyle w:val="a7"/>
+        <w:ind w:left="0"/>
+        <w:rPr>
+          <w:rFonts w:ascii="Times New Roman" w:eastAsia="Times New Roman" w:hAnsi="Times New Roman" w:cs="Times New Roman"/>
+          <w:kern w:val="0"/>
           <w:sz w:val="28"/>
           <w:szCs w:val="28"/>
-          <w:lang w:val="ru-KZ"/>
-        </w:rPr>
-      </w:pPr>
-      <w:r>
-        <w:rPr>
+          <w:lang w:val="ru-KZ" w:eastAsia="ru-KZ"/>
+          <w14:ligatures w14:val="none"/>
+        </w:rPr>
+      </w:pPr>
+      <w:r>
+        <w:rPr>
+          <w:rFonts w:ascii="Times New Roman" w:eastAsia="Times New Roman" w:hAnsi="Times New Roman" w:cs="Times New Roman"/>
+          <w:kern w:val="0"/>
           <w:sz w:val="28"/>
           <w:szCs w:val="28"/>
-          <w:lang w:val="ru-KZ"/>
-        </w:rPr>
-        <w:t xml:space="preserve">Пример запроса через </w:t>
+          <w:lang w:val="ru-KZ" w:eastAsia="ru-KZ"/>
+          <w14:ligatures w14:val="none"/>
+        </w:rPr>
+        <w:t xml:space="preserve">Тестирование с помощью </w:t>
       </w:r>
       <w:proofErr w:type="spellStart"/>
       <w:r>
         <w:rPr>
+          <w:rFonts w:ascii="Times New Roman" w:eastAsia="Times New Roman" w:hAnsi="Times New Roman" w:cs="Times New Roman"/>
+          <w:kern w:val="0"/>
           <w:sz w:val="28"/>
           <w:szCs w:val="28"/>
-          <w:lang w:val="ru-KZ"/>
-        </w:rPr>
-        <w:t>Postman:</w:t>
+          <w:lang w:val="ru-KZ" w:eastAsia="ru-KZ"/>
+          <w14:ligatures w14:val="none"/>
+        </w:rPr>
+        <w:t>Swagger</w:t>
+      </w:r>
+      <w:proofErr w:type="spellEnd"/>
+      <w:r>
+        <w:rPr>
+          <w:rFonts w:ascii="Times New Roman" w:eastAsia="Times New Roman" w:hAnsi="Times New Roman" w:cs="Times New Roman"/>
+          <w:kern w:val="0"/>
+          <w:sz w:val="28"/>
+          <w:szCs w:val="28"/>
+          <w:lang w:val="ru-KZ" w:eastAsia="ru-KZ"/>
+          <w14:ligatures w14:val="none"/>
+        </w:rPr>
+        <w:t xml:space="preserve"> UI</w:t>
+      </w:r>
+    </w:p>
+    <w:p>
+      <w:pPr>
+        <w:pStyle w:val="a7"/>
+        <w:ind w:left="0"/>
+        <w:rPr>
+          <w:rFonts w:ascii="Times New Roman" w:eastAsia="Times New Roman" w:hAnsi="Times New Roman" w:cs="Times New Roman"/>
+          <w:kern w:val="0"/>
+          <w:sz w:val="24"/>
+          <w:szCs w:val="24"/>
+          <w:lang w:val="ru-KZ" w:eastAsia="ru-KZ"/>
+          <w14:ligatures w14:val="none"/>
+        </w:rPr>
+      </w:pPr>
+      <w:r>
+        <w:rPr>
+          <w:rFonts w:ascii="Times New Roman" w:eastAsia="Times New Roman" w:hAnsi="Times New Roman" w:cs="Times New Roman"/>
+          <w:kern w:val="0"/>
+          <w:sz w:val="24"/>
+          <w:szCs w:val="24"/>
+          <w:lang w:val="ru-KZ" w:eastAsia="ru-KZ"/>
+          <w14:ligatures w14:val="none"/>
+        </w:rPr>
+        <w:t xml:space="preserve">Добавил в сервис </w:t>
+      </w:r>
+      <w:proofErr w:type="spellStart"/>
+      <w:r>
+        <w:rPr>
+          <w:rFonts w:ascii="Times New Roman" w:eastAsia="Times New Roman" w:hAnsi="Times New Roman" w:cs="Times New Roman"/>
+          <w:kern w:val="0"/>
+          <w:sz w:val="24"/>
+          <w:szCs w:val="24"/>
+          <w:lang w:val="ru-KZ" w:eastAsia="ru-KZ"/>
+          <w14:ligatures w14:val="none"/>
+        </w:rPr>
+        <w:t>OpenAPI</w:t>
+      </w:r>
+      <w:proofErr w:type="spellEnd"/>
+      <w:r>
+        <w:rPr>
+          <w:rFonts w:ascii="Times New Roman" w:eastAsia="Times New Roman" w:hAnsi="Times New Roman" w:cs="Times New Roman"/>
+          <w:kern w:val="0"/>
+          <w:sz w:val="24"/>
+          <w:szCs w:val="24"/>
+          <w:lang w:val="ru-KZ" w:eastAsia="ru-KZ"/>
+          <w14:ligatures w14:val="none"/>
+        </w:rPr>
+        <w:t>, после запуска контейнера перейдите по ссылке ниже:</w:t>
+      </w:r>
+      <w:r>
+        <w:rPr>
+          <w:rFonts w:ascii="Times New Roman" w:eastAsia="Times New Roman" w:hAnsi="Times New Roman" w:cs="Times New Roman"/>
+          <w:kern w:val="0"/>
+          <w:sz w:val="24"/>
+          <w:szCs w:val="24"/>
+          <w:lang w:val="ru-KZ" w:eastAsia="ru-KZ"/>
+          <w14:ligatures w14:val="none"/>
+        </w:rPr>
+        <w:br/>
+      </w:r>
+      <w:hyperlink r:id="rId6" w:history="1">
+        <w:r>
+          <w:rPr>
+            <w:rStyle w:val="ac"/>
+            <w:rFonts w:ascii="Times New Roman" w:eastAsia="Times New Roman" w:hAnsi="Times New Roman" w:cs="Times New Roman"/>
+            <w:kern w:val="0"/>
+            <w:sz w:val="24"/>
+            <w:szCs w:val="24"/>
+            <w:lang w:val="ru-KZ" w:eastAsia="ru-KZ"/>
+            <w14:ligatures w14:val="none"/>
+          </w:rPr>
+          <w:t>http://localhost:8080/swagger-ui/index.html</w:t>
+        </w:r>
+      </w:hyperlink>
+    </w:p>
+    <w:p>
+      <w:pPr>
+        <w:pStyle w:val="a7"/>
+        <w:ind w:left="0"/>
+        <w:rPr>
+          <w:rFonts w:ascii="Times New Roman" w:eastAsia="Times New Roman" w:hAnsi="Times New Roman" w:cs="Times New Roman"/>
+          <w:kern w:val="0"/>
+          <w:sz w:val="24"/>
+          <w:szCs w:val="24"/>
+          <w:lang w:val="ru-KZ" w:eastAsia="ru-KZ"/>
+          <w14:ligatures w14:val="none"/>
+        </w:rPr>
+      </w:pPr>
+      <w:r>
+        <w:rPr>
+          <w:rFonts w:ascii="Times New Roman" w:eastAsia="Times New Roman" w:hAnsi="Times New Roman" w:cs="Times New Roman"/>
+          <w:kern w:val="0"/>
+          <w:sz w:val="24"/>
+          <w:szCs w:val="24"/>
+          <w:lang w:val="ru-KZ" w:eastAsia="ru-KZ"/>
+          <w14:ligatures w14:val="none"/>
+        </w:rPr>
+        <w:t xml:space="preserve">Доступные </w:t>
+      </w:r>
+      <w:proofErr w:type="spellStart"/>
+      <w:r>
+        <w:rPr>
+          <w:rFonts w:ascii="Times New Roman" w:eastAsia="Times New Roman" w:hAnsi="Times New Roman" w:cs="Times New Roman"/>
+          <w:kern w:val="0"/>
+          <w:sz w:val="24"/>
+          <w:szCs w:val="24"/>
+          <w:lang w:val="ru-KZ" w:eastAsia="ru-KZ"/>
+          <w14:ligatures w14:val="none"/>
+        </w:rPr>
+        <w:t>endpoint:</w:t>
       </w:r>
       <w:proofErr w:type="spellEnd"/>
     </w:p>
@@ -396,186 +518,140 @@
         <w:pStyle w:val="a7"/>
         <w:numPr>
           <w:ilvl w:val="0"/>
-          <w:numId w:val="5"/>
+          <w:numId w:val="8"/>
         </w:numPr>
         <w:rPr>
-          <w:rFonts w:cstheme="minorHAnsi"/>
-          <w:sz w:val="24"/>
-          <w:szCs w:val="24"/>
-          <w:lang w:val="ru-KZ"/>
-        </w:rPr>
-      </w:pPr>
-      <w:r>
-        <w:rPr>
-          <w:rFonts w:cstheme="minorHAnsi"/>
-          <w:sz w:val="24"/>
-          <w:szCs w:val="24"/>
-          <w:lang w:val="ru-KZ"/>
-        </w:rPr>
-        <w:t>Установите метод POST.</w:t>
-      </w:r>
+          <w:rFonts w:ascii="Times New Roman" w:eastAsia="Times New Roman" w:hAnsi="Times New Roman" w:cs="Times New Roman"/>
+          <w:kern w:val="0"/>
+          <w:sz w:val="24"/>
+          <w:szCs w:val="24"/>
+          <w:lang w:val="ru-KZ" w:eastAsia="ru-KZ"/>
+          <w14:ligatures w14:val="none"/>
+        </w:rPr>
+      </w:pPr>
+      <w:r>
+        <w:rPr>
+          <w:rFonts w:ascii="Times New Roman" w:eastAsia="Times New Roman" w:hAnsi="Times New Roman" w:cs="Times New Roman"/>
+          <w:kern w:val="0"/>
+          <w:sz w:val="24"/>
+          <w:szCs w:val="24"/>
+          <w:lang w:val="ru-KZ" w:eastAsia="ru-KZ"/>
+          <w14:ligatures w14:val="none"/>
+        </w:rPr>
+        <w:t>Проверка ПДФ файла, анализ: метод "POST /</w:t>
+      </w:r>
+      <w:proofErr w:type="spellStart"/>
+      <w:r>
+        <w:rPr>
+          <w:rFonts w:ascii="Times New Roman" w:eastAsia="Times New Roman" w:hAnsi="Times New Roman" w:cs="Times New Roman"/>
+          <w:kern w:val="0"/>
+          <w:sz w:val="24"/>
+          <w:szCs w:val="24"/>
+          <w:lang w:val="ru-KZ" w:eastAsia="ru-KZ"/>
+          <w14:ligatures w14:val="none"/>
+        </w:rPr>
+        <w:t>api</w:t>
+      </w:r>
+      <w:proofErr w:type="spellEnd"/>
+      <w:r>
+        <w:rPr>
+          <w:rFonts w:ascii="Times New Roman" w:eastAsia="Times New Roman" w:hAnsi="Times New Roman" w:cs="Times New Roman"/>
+          <w:kern w:val="0"/>
+          <w:sz w:val="24"/>
+          <w:szCs w:val="24"/>
+          <w:lang w:val="ru-KZ" w:eastAsia="ru-KZ"/>
+          <w14:ligatures w14:val="none"/>
+        </w:rPr>
+        <w:t>/</w:t>
+      </w:r>
+      <w:proofErr w:type="spellStart"/>
+      <w:r>
+        <w:rPr>
+          <w:rFonts w:ascii="Times New Roman" w:eastAsia="Times New Roman" w:hAnsi="Times New Roman" w:cs="Times New Roman"/>
+          <w:kern w:val="0"/>
+          <w:sz w:val="24"/>
+          <w:szCs w:val="24"/>
+          <w:lang w:val="ru-KZ" w:eastAsia="ru-KZ"/>
+          <w14:ligatures w14:val="none"/>
+        </w:rPr>
+        <w:t>pdf-check"</w:t>
+      </w:r>
+      <w:proofErr w:type="spellEnd"/>
     </w:p>
     <w:p>
       <w:pPr>
         <w:pStyle w:val="a7"/>
         <w:numPr>
           <w:ilvl w:val="0"/>
-          <w:numId w:val="5"/>
+          <w:numId w:val="8"/>
         </w:numPr>
         <w:rPr>
-          <w:rFonts w:cstheme="minorHAnsi"/>
-          <w:sz w:val="24"/>
-          <w:szCs w:val="24"/>
-          <w:lang w:val="ru-KZ"/>
-        </w:rPr>
-      </w:pPr>
-      <w:r>
-        <w:rPr>
-          <w:rFonts w:cstheme="minorHAnsi"/>
-          <w:sz w:val="24"/>
-          <w:szCs w:val="24"/>
-          <w:lang w:val="ru-KZ"/>
-        </w:rPr>
-        <w:t xml:space="preserve">URL: </w:t>
-      </w:r>
-      <w:r>
-        <w:rPr>
-          <w:rStyle w:val="HTML1"/>
-          <w:rFonts w:asciiTheme="minorHAnsi" w:eastAsiaTheme="majorEastAsia" w:hAnsiTheme="minorHAnsi" w:cstheme="minorHAnsi"/>
-          <w:sz w:val="24"/>
-          <w:szCs w:val="24"/>
-        </w:rPr>
-        <w:t>http://localhost:8080/api/pdf-check</w:t>
-      </w:r>
-    </w:p>
-    <w:p>
-      <w:pPr>
-        <w:pStyle w:val="a7"/>
-        <w:numPr>
-          <w:ilvl w:val="0"/>
-          <w:numId w:val="5"/>
-        </w:numPr>
-        <w:rPr>
-          <w:rFonts w:cstheme="minorHAnsi"/>
-          <w:sz w:val="24"/>
-          <w:szCs w:val="24"/>
-          <w:lang w:val="ru-KZ"/>
-        </w:rPr>
-      </w:pPr>
-      <w:r>
-        <w:rPr>
-          <w:rFonts w:cstheme="minorHAnsi"/>
-          <w:sz w:val="24"/>
-          <w:szCs w:val="24"/>
-          <w:lang w:val="ru-KZ"/>
-        </w:rPr>
-        <w:t xml:space="preserve">Перейдите во вкладку Body -&gt; </w:t>
+          <w:rFonts w:ascii="Times New Roman" w:eastAsia="Times New Roman" w:hAnsi="Times New Roman" w:cs="Times New Roman"/>
+          <w:kern w:val="0"/>
+          <w:sz w:val="24"/>
+          <w:szCs w:val="24"/>
+          <w:lang w:val="ru-KZ" w:eastAsia="ru-KZ"/>
+          <w14:ligatures w14:val="none"/>
+        </w:rPr>
+      </w:pPr>
+      <w:r>
+        <w:rPr>
+          <w:rFonts w:ascii="Times New Roman" w:eastAsia="Times New Roman" w:hAnsi="Times New Roman" w:cs="Times New Roman"/>
+          <w:kern w:val="0"/>
+          <w:sz w:val="24"/>
+          <w:szCs w:val="24"/>
+          <w:lang w:val="ru-KZ" w:eastAsia="ru-KZ"/>
+          <w14:ligatures w14:val="none"/>
+        </w:rPr>
+        <w:t>Очистка файла: метод "POSR /</w:t>
       </w:r>
       <w:proofErr w:type="spellStart"/>
       <w:r>
         <w:rPr>
-          <w:rFonts w:cstheme="minorHAnsi"/>
-          <w:sz w:val="24"/>
-          <w:szCs w:val="24"/>
-          <w:lang w:val="ru-KZ"/>
-        </w:rPr>
-        <w:t>form-data</w:t>
+          <w:rFonts w:ascii="Times New Roman" w:eastAsia="Times New Roman" w:hAnsi="Times New Roman" w:cs="Times New Roman"/>
+          <w:kern w:val="0"/>
+          <w:sz w:val="24"/>
+          <w:szCs w:val="24"/>
+          <w:lang w:val="ru-KZ" w:eastAsia="ru-KZ"/>
+          <w14:ligatures w14:val="none"/>
+        </w:rPr>
+        <w:t>api</w:t>
       </w:r>
       <w:proofErr w:type="spellEnd"/>
       <w:r>
         <w:rPr>
-          <w:rFonts w:cstheme="minorHAnsi"/>
-          <w:sz w:val="24"/>
-          <w:szCs w:val="24"/>
-          <w:lang w:val="ru-KZ"/>
-        </w:rPr>
-        <w:t>.</w:t>
-      </w:r>
-    </w:p>
-    <w:p>
-      <w:pPr>
-        <w:pStyle w:val="a7"/>
-        <w:numPr>
-          <w:ilvl w:val="0"/>
-          <w:numId w:val="5"/>
-        </w:numPr>
-        <w:rPr>
-          <w:rFonts w:cstheme="minorHAnsi"/>
-          <w:sz w:val="24"/>
-          <w:szCs w:val="24"/>
-          <w:lang w:val="ru-KZ"/>
-        </w:rPr>
-      </w:pPr>
-      <w:r>
-        <w:rPr>
-          <w:rFonts w:cstheme="minorHAnsi"/>
-          <w:sz w:val="24"/>
-          <w:szCs w:val="24"/>
-          <w:lang w:val="ru-KZ"/>
-        </w:rPr>
-        <w:t xml:space="preserve">Создайте ключ </w:t>
+          <w:rFonts w:ascii="Times New Roman" w:eastAsia="Times New Roman" w:hAnsi="Times New Roman" w:cs="Times New Roman"/>
+          <w:kern w:val="0"/>
+          <w:sz w:val="24"/>
+          <w:szCs w:val="24"/>
+          <w:lang w:val="ru-KZ" w:eastAsia="ru-KZ"/>
+          <w14:ligatures w14:val="none"/>
+        </w:rPr>
+        <w:t>/</w:t>
       </w:r>
       <w:proofErr w:type="spellStart"/>
       <w:r>
         <w:rPr>
-          <w:rFonts w:cstheme="minorHAnsi"/>
-          <w:sz w:val="24"/>
-          <w:szCs w:val="24"/>
-          <w:lang w:val="ru-KZ"/>
-        </w:rPr>
-        <w:t>file</w:t>
+          <w:rFonts w:ascii="Times New Roman" w:eastAsia="Times New Roman" w:hAnsi="Times New Roman" w:cs="Times New Roman"/>
+          <w:kern w:val="0"/>
+          <w:sz w:val="24"/>
+          <w:szCs w:val="24"/>
+          <w:lang w:val="ru-KZ" w:eastAsia="ru-KZ"/>
+          <w14:ligatures w14:val="none"/>
+        </w:rPr>
+        <w:t>pdf-sanitize</w:t>
       </w:r>
       <w:proofErr w:type="spellEnd"/>
       <w:r>
         <w:rPr>
-          <w:rFonts w:cstheme="minorHAnsi"/>
-          <w:sz w:val="24"/>
-          <w:szCs w:val="24"/>
-          <w:lang w:val="ru-KZ"/>
-        </w:rPr>
-        <w:t xml:space="preserve"> (тип выберите File).</w:t>
-      </w:r>
-    </w:p>
-    <w:p>
-      <w:pPr>
-        <w:pStyle w:val="a7"/>
-        <w:numPr>
-          <w:ilvl w:val="0"/>
-          <w:numId w:val="5"/>
-        </w:numPr>
-        <w:rPr>
-          <w:rFonts w:cstheme="minorHAnsi"/>
-          <w:sz w:val="24"/>
-          <w:szCs w:val="24"/>
-          <w:lang w:val="ru-KZ"/>
-        </w:rPr>
-      </w:pPr>
-      <w:r>
-        <w:rPr>
-          <w:rFonts w:cstheme="minorHAnsi"/>
-          <w:sz w:val="24"/>
-          <w:szCs w:val="24"/>
-          <w:lang w:val="ru-KZ"/>
-        </w:rPr>
-        <w:t>Выберите PDF-файл для загрузки</w:t>
-      </w:r>
-      <w:r>
-        <w:rPr>
-          <w:rFonts w:cstheme="minorHAnsi"/>
-          <w:sz w:val="24"/>
-          <w:szCs w:val="24"/>
-          <w:lang w:val="ru-KZ"/>
-        </w:rPr>
-        <w:t xml:space="preserve"> и нажмите отправить.</w:t>
-      </w:r>
-      <w:r>
-        <w:rPr>
-          <w:rFonts w:cstheme="minorHAnsi"/>
-          <w:sz w:val="24"/>
-          <w:szCs w:val="24"/>
-          <w:lang w:val="ru-KZ"/>
-        </w:rPr>
-        <w:t xml:space="preserve">  </w:t>
+          <w:rFonts w:ascii="Times New Roman" w:eastAsia="Times New Roman" w:hAnsi="Times New Roman" w:cs="Times New Roman"/>
+          <w:kern w:val="0"/>
+          <w:sz w:val="24"/>
+          <w:szCs w:val="24"/>
+          <w:lang w:val="ru-KZ" w:eastAsia="ru-KZ"/>
+          <w14:ligatures w14:val="none"/>
+        </w:rPr>
+        <w:t>"</w:t>
       </w:r>
     </w:p>
     <w:p>
@@ -877,6 +953,92 @@
 <file path=word/numbering.xml><?xml version="1.0" encoding="utf-8"?>
 <w:numbering xmlns:wpc="http://schemas.microsoft.com/office/word/2010/wordprocessingCanvas" xmlns:cx="http://schemas.microsoft.com/office/drawing/2014/chartex" xmlns:cx1="http://schemas.microsoft.com/office/drawing/2015/9/8/chartex" xmlns:cx2="http://schemas.microsoft.com/office/drawing/2015/10/21/chartex" xmlns:cx3="http://schemas.microsoft.com/office/drawing/2016/5/9/chartex" xmlns:cx4="http://schemas.microsoft.com/office/drawing/2016/5/10/chartex" xmlns:cx5="http://schemas.microsoft.com/office/drawing/2016/5/11/chartex" xmlns:cx6="http://schemas.microsoft.com/office/drawing/2016/5/12/chartex" xmlns:cx7="http://schemas.microsoft.com/office/drawing/2016/5/13/chartex" xmlns:cx8="http://schemas.microsoft.com/office/drawing/2016/5/14/chartex" xmlns:mc="http://schemas.openxmlformats.org/markup-compatibility/2006" xmlns:aink="http://schemas.microsoft.com/office/drawing/2016/ink" xmlns:am3d="http://schemas.microsoft.com/office/drawing/2017/model3d" xmlns:o="urn:schemas-microsoft-com:office:office" xmlns:oel="http://schemas.microsoft.com/office/2019/extlst" xmlns:r="http://schemas.openxmlformats.org/officeDocument/2006/relationships" xmlns:m="http://schemas.openxmlformats.org/officeDocument/2006/math" xmlns:v="urn:schemas-microsoft-com:vml" xmlns:wp14="http://schemas.microsoft.com/office/word/2010/wordprocessingDrawing" xmlns:wp="http://schemas.openxmlformats.org/drawingml/2006/wordprocessingDrawing" xmlns:w10="urn:schemas-microsoft-com:office:word" xmlns:w="http://schemas.openxmlformats.org/wordprocessingml/2006/main" xmlns:w14="http://schemas.microsoft.com/office/word/2010/wordml" xmlns:w15="http://schemas.microsoft.com/office/word/2012/wordml" xmlns:w16cex="http://schemas.microsoft.com/office/word/2018/wordml/cex" xmlns:w16cid="http://schemas.microsoft.com/office/word/2016/wordml/cid" xmlns:w16="http://schemas.microsoft.com/office/word/2018/wordml" xmlns:w16du="http://schemas.microsoft.com/office/word/2023/wordml/word16du" xmlns:w16sdtdh="http://schemas.microsoft.com/office/word/2020/wordml/sdtdatahash" xmlns:w16sdtfl="http://schemas.microsoft.com/office/word/2024/wordml/sdtformatlock" xmlns:w16se="http://schemas.microsoft.com/office/word/2015/wordml/symex" xmlns:wpg="http://schemas.microsoft.com/office/word/2010/wordprocessingGroup" xmlns:wpi="http://schemas.microsoft.com/office/word/2010/wordprocessingInk" xmlns:wne="http://schemas.microsoft.com/office/word/2006/wordml" xmlns:wps="http://schemas.microsoft.com/office/word/2010/wordprocessingShape" mc:Ignorable="w14 w15 w16se w16cid w16 w16cex w16sdtdh w16sdtfl w16du wp14">
   <w:abstractNum w:abstractNumId="0" w15:restartNumberingAfterBreak="0">
+    <w:nsid w:val="056D5E86"/>
+    <w:multiLevelType w:val="hybridMultilevel"/>
+    <w:tmpl w:val="EC4E18FC"/>
+    <w:lvl w:ilvl="0" w:tplc="FFFFFFFF">
+      <w:start w:val="1"/>
+      <w:numFmt w:val="decimal"/>
+      <w:lvlText w:val="%1."/>
+      <w:lvlJc w:val="left"/>
+      <w:pPr>
+        <w:ind w:left="720" w:hanging="360"/>
+      </w:pPr>
+    </w:lvl>
+    <w:lvl w:ilvl="1" w:tplc="FFFFFFFF" w:tentative="1">
+      <w:start w:val="1"/>
+      <w:numFmt w:val="lowerLetter"/>
+      <w:lvlText w:val="%2."/>
+      <w:lvlJc w:val="left"/>
+      <w:pPr>
+        <w:ind w:left="1440" w:hanging="360"/>
+      </w:pPr>
+    </w:lvl>
+    <w:lvl w:ilvl="2" w:tplc="FFFFFFFF" w:tentative="1">
+      <w:start w:val="1"/>
+      <w:numFmt w:val="lowerRoman"/>
+      <w:lvlText w:val="%3."/>
+      <w:lvlJc w:val="right"/>
+      <w:pPr>
+        <w:ind w:left="2160" w:hanging="180"/>
+      </w:pPr>
+    </w:lvl>
+    <w:lvl w:ilvl="3" w:tplc="FFFFFFFF" w:tentative="1">
+      <w:start w:val="1"/>
+      <w:numFmt w:val="decimal"/>
+      <w:lvlText w:val="%4."/>
+      <w:lvlJc w:val="left"/>
+      <w:pPr>
+        <w:ind w:left="2880" w:hanging="360"/>
+      </w:pPr>
+    </w:lvl>
+    <w:lvl w:ilvl="4" w:tplc="FFFFFFFF" w:tentative="1">
+      <w:start w:val="1"/>
+      <w:numFmt w:val="lowerLetter"/>
+      <w:lvlText w:val="%5."/>
+      <w:lvlJc w:val="left"/>
+      <w:pPr>
+        <w:ind w:left="3600" w:hanging="360"/>
+      </w:pPr>
+    </w:lvl>
+    <w:lvl w:ilvl="5" w:tplc="FFFFFFFF" w:tentative="1">
+      <w:start w:val="1"/>
+      <w:numFmt w:val="lowerRoman"/>
+      <w:lvlText w:val="%6."/>
+      <w:lvlJc w:val="right"/>
+      <w:pPr>
+        <w:ind w:left="4320" w:hanging="180"/>
+      </w:pPr>
+    </w:lvl>
+    <w:lvl w:ilvl="6" w:tplc="FFFFFFFF" w:tentative="1">
+      <w:start w:val="1"/>
+      <w:numFmt w:val="decimal"/>
+      <w:lvlText w:val="%7."/>
+      <w:lvlJc w:val="left"/>
+      <w:pPr>
+        <w:ind w:left="5040" w:hanging="360"/>
+      </w:pPr>
+    </w:lvl>
+    <w:lvl w:ilvl="7" w:tplc="FFFFFFFF" w:tentative="1">
+      <w:start w:val="1"/>
+      <w:numFmt w:val="lowerLetter"/>
+      <w:lvlText w:val="%8."/>
+      <w:lvlJc w:val="left"/>
+      <w:pPr>
+        <w:ind w:left="5760" w:hanging="360"/>
+      </w:pPr>
+    </w:lvl>
+    <w:lvl w:ilvl="8" w:tplc="FFFFFFFF" w:tentative="1">
+      <w:start w:val="1"/>
+      <w:numFmt w:val="lowerRoman"/>
+      <w:lvlText w:val="%9."/>
+      <w:lvlJc w:val="right"/>
+      <w:pPr>
+        <w:ind w:left="6480" w:hanging="180"/>
+      </w:pPr>
+    </w:lvl>
+  </w:abstractNum>
+  <w:abstractNum w:abstractNumId="1" w15:restartNumberingAfterBreak="0">
     <w:nsid w:val="09D7260D"/>
     <w:multiLevelType w:val="hybridMultilevel"/>
     <w:tmpl w:val="020E386A"/>
@@ -962,7 +1124,7 @@
       </w:pPr>
     </w:lvl>
   </w:abstractNum>
-  <w:abstractNum w:abstractNumId="1" w15:restartNumberingAfterBreak="0">
+  <w:abstractNum w:abstractNumId="2" w15:restartNumberingAfterBreak="0">
     <w:nsid w:val="1C5528DB"/>
     <w:multiLevelType w:val="hybridMultilevel"/>
     <w:tmpl w:val="6E58AC8C"/>
@@ -1075,7 +1237,7 @@
       </w:rPr>
     </w:lvl>
   </w:abstractNum>
-  <w:abstractNum w:abstractNumId="2" w15:restartNumberingAfterBreak="0">
+  <w:abstractNum w:abstractNumId="3" w15:restartNumberingAfterBreak="0">
     <w:nsid w:val="34CD4814"/>
     <w:multiLevelType w:val="hybridMultilevel"/>
     <w:tmpl w:val="020E386A"/>
@@ -1161,7 +1323,7 @@
       </w:pPr>
     </w:lvl>
   </w:abstractNum>
-  <w:abstractNum w:abstractNumId="3" w15:restartNumberingAfterBreak="0">
+  <w:abstractNum w:abstractNumId="4" w15:restartNumberingAfterBreak="0">
     <w:nsid w:val="4BB366F8"/>
     <w:multiLevelType w:val="multilevel"/>
     <w:tmpl w:val="F8300750"/>
@@ -1274,7 +1436,93 @@
       </w:pPr>
     </w:lvl>
   </w:abstractNum>
-  <w:abstractNum w:abstractNumId="4" w15:restartNumberingAfterBreak="0">
+  <w:abstractNum w:abstractNumId="5" w15:restartNumberingAfterBreak="0">
+    <w:nsid w:val="4CA342C8"/>
+    <w:multiLevelType w:val="hybridMultilevel"/>
+    <w:tmpl w:val="8F647454"/>
+    <w:lvl w:ilvl="0" w:tplc="FFFFFFFF">
+      <w:start w:val="1"/>
+      <w:numFmt w:val="decimal"/>
+      <w:lvlText w:val="%1."/>
+      <w:lvlJc w:val="left"/>
+      <w:pPr>
+        <w:ind w:left="720" w:hanging="360"/>
+      </w:pPr>
+    </w:lvl>
+    <w:lvl w:ilvl="1" w:tplc="20000019" w:tentative="1">
+      <w:start w:val="1"/>
+      <w:numFmt w:val="lowerLetter"/>
+      <w:lvlText w:val="%2."/>
+      <w:lvlJc w:val="left"/>
+      <w:pPr>
+        <w:ind w:left="1440" w:hanging="360"/>
+      </w:pPr>
+    </w:lvl>
+    <w:lvl w:ilvl="2" w:tplc="2000001B" w:tentative="1">
+      <w:start w:val="1"/>
+      <w:numFmt w:val="lowerRoman"/>
+      <w:lvlText w:val="%3."/>
+      <w:lvlJc w:val="right"/>
+      <w:pPr>
+        <w:ind w:left="2160" w:hanging="180"/>
+      </w:pPr>
+    </w:lvl>
+    <w:lvl w:ilvl="3" w:tplc="2000000F" w:tentative="1">
+      <w:start w:val="1"/>
+      <w:numFmt w:val="decimal"/>
+      <w:lvlText w:val="%4."/>
+      <w:lvlJc w:val="left"/>
+      <w:pPr>
+        <w:ind w:left="2880" w:hanging="360"/>
+      </w:pPr>
+    </w:lvl>
+    <w:lvl w:ilvl="4" w:tplc="20000019" w:tentative="1">
+      <w:start w:val="1"/>
+      <w:numFmt w:val="lowerLetter"/>
+      <w:lvlText w:val="%5."/>
+      <w:lvlJc w:val="left"/>
+      <w:pPr>
+        <w:ind w:left="3600" w:hanging="360"/>
+      </w:pPr>
+    </w:lvl>
+    <w:lvl w:ilvl="5" w:tplc="2000001B" w:tentative="1">
+      <w:start w:val="1"/>
+      <w:numFmt w:val="lowerRoman"/>
+      <w:lvlText w:val="%6."/>
+      <w:lvlJc w:val="right"/>
+      <w:pPr>
+        <w:ind w:left="4320" w:hanging="180"/>
+      </w:pPr>
+    </w:lvl>
+    <w:lvl w:ilvl="6" w:tplc="2000000F" w:tentative="1">
+      <w:start w:val="1"/>
+      <w:numFmt w:val="decimal"/>
+      <w:lvlText w:val="%7."/>
+      <w:lvlJc w:val="left"/>
+      <w:pPr>
+        <w:ind w:left="5040" w:hanging="360"/>
+      </w:pPr>
+    </w:lvl>
+    <w:lvl w:ilvl="7" w:tplc="20000019" w:tentative="1">
+      <w:start w:val="1"/>
+      <w:numFmt w:val="lowerLetter"/>
+      <w:lvlText w:val="%8."/>
+      <w:lvlJc w:val="left"/>
+      <w:pPr>
+        <w:ind w:left="5760" w:hanging="360"/>
+      </w:pPr>
+    </w:lvl>
+    <w:lvl w:ilvl="8" w:tplc="2000001B" w:tentative="1">
+      <w:start w:val="1"/>
+      <w:numFmt w:val="lowerRoman"/>
+      <w:lvlText w:val="%9."/>
+      <w:lvlJc w:val="right"/>
+      <w:pPr>
+        <w:ind w:left="6480" w:hanging="180"/>
+      </w:pPr>
+    </w:lvl>
+  </w:abstractNum>
+  <w:abstractNum w:abstractNumId="6" w15:restartNumberingAfterBreak="0">
     <w:nsid w:val="6CC521D1"/>
     <w:multiLevelType w:val="hybridMultilevel"/>
     <w:tmpl w:val="158885A6"/>
@@ -1360,10 +1608,10 @@
       </w:pPr>
     </w:lvl>
   </w:abstractNum>
-  <w:abstractNum w:abstractNumId="5" w15:restartNumberingAfterBreak="0">
+  <w:abstractNum w:abstractNumId="7" w15:restartNumberingAfterBreak="0">
     <w:nsid w:val="7EA84492"/>
     <w:multiLevelType w:val="hybridMultilevel"/>
-    <w:tmpl w:val="020E386A"/>
+    <w:tmpl w:val="EC4E18FC"/>
     <w:lvl w:ilvl="0" w:tplc="2000000F">
       <w:start w:val="1"/>
       <w:numFmt w:val="decimal"/>
@@ -1447,22 +1695,28 @@
     </w:lvl>
   </w:abstractNum>
   <w:num w:numId="1" w16cid:durableId="2002082995">
-    <w:abstractNumId w:val="5"/>
+    <w:abstractNumId w:val="7"/>
   </w:num>
   <w:num w:numId="2" w16cid:durableId="2125877768">
+    <w:abstractNumId w:val="4"/>
+  </w:num>
+  <w:num w:numId="3" w16cid:durableId="1890994940">
     <w:abstractNumId w:val="3"/>
   </w:num>
-  <w:num w:numId="3" w16cid:durableId="1890994940">
+  <w:num w:numId="4" w16cid:durableId="1974092833">
+    <w:abstractNumId w:val="1"/>
+  </w:num>
+  <w:num w:numId="5" w16cid:durableId="538510755">
+    <w:abstractNumId w:val="6"/>
+  </w:num>
+  <w:num w:numId="6" w16cid:durableId="1139955951">
     <w:abstractNumId w:val="2"/>
   </w:num>
-  <w:num w:numId="4" w16cid:durableId="1974092833">
+  <w:num w:numId="7" w16cid:durableId="2032023730">
     <w:abstractNumId w:val="0"/>
   </w:num>
-  <w:num w:numId="5" w16cid:durableId="538510755">
-    <w:abstractNumId w:val="4"/>
-  </w:num>
-  <w:num w:numId="6" w16cid:durableId="1139955951">
-    <w:abstractNumId w:val="1"/>
+  <w:num w:numId="8" w16cid:durableId="388723698">
+    <w:abstractNumId w:val="5"/>
   </w:num>
 </w:numbering>
 </file>
@@ -2070,6 +2324,7 @@
   <w:style w:type="character" w:default="1" w:styleId="a0">
     <w:name w:val="Default Paragraph Font"/>
     <w:uiPriority w:val="1"/>
+    <w:semiHidden/>
     <w:unhideWhenUsed/>
   </w:style>
   <w:style w:type="table" w:default="1" w:styleId="a1">
@@ -2417,7 +2672,7 @@
       <w:kern w:val="0"/>
       <w:sz w:val="20"/>
       <w:szCs w:val="20"/>
-      <w:lang w:val="ru-KZ" w:eastAsia="ru-KZ"/>
+      <w:lang w:eastAsia="ru-KZ"/>
       <w14:ligatures w14:val="none"/>
     </w:rPr>
   </w:style>
@@ -2499,7 +2754,7 @@
       <w:kern w:val="0"/>
       <w:sz w:val="24"/>
       <w:szCs w:val="24"/>
-      <w:lang w:val="ru-KZ" w:eastAsia="ru-KZ"/>
+      <w:lang w:eastAsia="ru-KZ"/>
       <w14:ligatures w14:val="none"/>
     </w:rPr>
   </w:style>

</xml_diff>

<commit_message>
Update documentation and JWT implementation
</commit_message>
<xml_diff>
--- a/Инструкция по запуску.docx
+++ b/Инструкция по запуску.docx
@@ -157,7 +157,6 @@
           <w:szCs w:val="28"/>
         </w:rPr>
       </w:pPr>
-      <w:proofErr w:type="spellStart"/>
       <w:r>
         <w:rPr>
           <w:rFonts w:eastAsia="Times New Roman" w:cstheme="minorHAnsi"/>
@@ -165,57 +164,7 @@
           <w:lang w:eastAsia="ru-KZ"/>
           <w14:ligatures w14:val="none"/>
         </w:rPr>
-        <w:t>docker</w:t>
-      </w:r>
-      <w:proofErr w:type="spellEnd"/>
-      <w:r>
-        <w:rPr>
-          <w:rFonts w:eastAsia="Times New Roman" w:cstheme="minorHAnsi"/>
-          <w:kern w:val="0"/>
-          <w:lang w:eastAsia="ru-KZ"/>
-          <w14:ligatures w14:val="none"/>
-        </w:rPr>
-        <w:t xml:space="preserve"> </w:t>
-      </w:r>
-      <w:proofErr w:type="spellStart"/>
-      <w:r>
-        <w:rPr>
-          <w:rFonts w:eastAsia="Times New Roman" w:cstheme="minorHAnsi"/>
-          <w:kern w:val="0"/>
-          <w:lang w:eastAsia="ru-KZ"/>
-          <w14:ligatures w14:val="none"/>
-        </w:rPr>
-        <w:t>build</w:t>
-      </w:r>
-      <w:proofErr w:type="spellEnd"/>
-      <w:r>
-        <w:rPr>
-          <w:rFonts w:eastAsia="Times New Roman" w:cstheme="minorHAnsi"/>
-          <w:kern w:val="0"/>
-          <w:lang w:eastAsia="ru-KZ"/>
-          <w14:ligatures w14:val="none"/>
-        </w:rPr>
-        <w:t xml:space="preserve"> -t </w:t>
-      </w:r>
-      <w:proofErr w:type="spellStart"/>
-      <w:r>
-        <w:rPr>
-          <w:rFonts w:eastAsia="Times New Roman" w:cstheme="minorHAnsi"/>
-          <w:kern w:val="0"/>
-          <w:lang w:eastAsia="ru-KZ"/>
-          <w14:ligatures w14:val="none"/>
-        </w:rPr>
-        <w:t>pdf-check-service</w:t>
-      </w:r>
-      <w:proofErr w:type="spellEnd"/>
-      <w:r>
-        <w:rPr>
-          <w:rFonts w:eastAsia="Times New Roman" w:cstheme="minorHAnsi"/>
-          <w:kern w:val="0"/>
-          <w:lang w:eastAsia="ru-KZ"/>
-          <w14:ligatures w14:val="none"/>
-        </w:rPr>
-        <w:t xml:space="preserve"> .</w:t>
+        <w:t>docker build -t pdf-check-service .</w:t>
       </w:r>
     </w:p>
     <w:p>
@@ -247,79 +196,13 @@
           <w:lang w:val="en-US"/>
         </w:rPr>
       </w:pPr>
-      <w:proofErr w:type="spellStart"/>
-      <w:r>
-        <w:rPr>
-          <w:sz w:val="24"/>
-          <w:szCs w:val="24"/>
-        </w:rPr>
-        <w:t>docker</w:t>
-      </w:r>
-      <w:proofErr w:type="spellEnd"/>
-      <w:r>
-        <w:rPr>
-          <w:sz w:val="24"/>
-          <w:szCs w:val="24"/>
-        </w:rPr>
-        <w:t xml:space="preserve"> </w:t>
-      </w:r>
-      <w:proofErr w:type="spellStart"/>
-      <w:r>
-        <w:rPr>
-          <w:sz w:val="24"/>
-          <w:szCs w:val="24"/>
-        </w:rPr>
-        <w:t>run</w:t>
-      </w:r>
-      <w:proofErr w:type="spellEnd"/>
-      <w:r>
-        <w:rPr>
-          <w:sz w:val="24"/>
-          <w:szCs w:val="24"/>
-        </w:rPr>
-        <w:t xml:space="preserve"> -d -p 8080:8080 --</w:t>
-      </w:r>
-      <w:proofErr w:type="spellStart"/>
-      <w:r>
-        <w:rPr>
-          <w:sz w:val="24"/>
-          <w:szCs w:val="24"/>
-        </w:rPr>
-        <w:t>name</w:t>
-      </w:r>
-      <w:proofErr w:type="spellEnd"/>
-      <w:r>
-        <w:rPr>
-          <w:sz w:val="24"/>
-          <w:szCs w:val="24"/>
-        </w:rPr>
-        <w:t xml:space="preserve"> </w:t>
-      </w:r>
-      <w:proofErr w:type="spellStart"/>
-      <w:r>
-        <w:rPr>
-          <w:sz w:val="24"/>
-          <w:szCs w:val="24"/>
-        </w:rPr>
-        <w:t>pdf-check-service</w:t>
-      </w:r>
-      <w:proofErr w:type="spellEnd"/>
-      <w:r>
-        <w:rPr>
-          <w:sz w:val="24"/>
-          <w:szCs w:val="24"/>
-        </w:rPr>
-        <w:t xml:space="preserve"> </w:t>
-      </w:r>
-      <w:proofErr w:type="spellStart"/>
-      <w:r>
-        <w:rPr>
-          <w:sz w:val="24"/>
-          <w:szCs w:val="24"/>
-        </w:rPr>
-        <w:t>pdf-check-service</w:t>
-      </w:r>
-      <w:proofErr w:type="spellEnd"/>
+      <w:r>
+        <w:rPr>
+          <w:sz w:val="24"/>
+          <w:szCs w:val="24"/>
+        </w:rPr>
+        <w:t>docker run -d -p 8080:8080 --name pdf-check-service pdf-check-service</w:t>
+      </w:r>
     </w:p>
     <w:p>
       <w:pPr>
@@ -361,7 +244,7 @@
           <w:kern w:val="0"/>
           <w:sz w:val="28"/>
           <w:szCs w:val="28"/>
-          <w:lang w:val="ru-KZ" w:eastAsia="ru-KZ"/>
+          <w:lang w:eastAsia="ru-KZ"/>
           <w14:ligatures w14:val="none"/>
         </w:rPr>
       </w:pPr>
@@ -371,91 +254,43 @@
           <w:kern w:val="0"/>
           <w:sz w:val="28"/>
           <w:szCs w:val="28"/>
-          <w:lang w:val="ru-KZ" w:eastAsia="ru-KZ"/>
+          <w:lang w:eastAsia="ru-KZ"/>
           <w14:ligatures w14:val="none"/>
         </w:rPr>
-        <w:t xml:space="preserve">Тестирование с помощью </w:t>
-      </w:r>
-      <w:proofErr w:type="spellStart"/>
-      <w:r>
+        <w:t>Тестирование с помощью Swagger UI</w:t>
+      </w:r>
+    </w:p>
+    <w:p>
+      <w:pPr>
+        <w:pStyle w:val="a7"/>
+        <w:ind w:left="0"/>
         <w:rPr>
           <w:rFonts w:ascii="Times New Roman" w:eastAsia="Times New Roman" w:hAnsi="Times New Roman" w:cs="Times New Roman"/>
           <w:kern w:val="0"/>
-          <w:sz w:val="28"/>
-          <w:szCs w:val="28"/>
-          <w:lang w:val="ru-KZ" w:eastAsia="ru-KZ"/>
+          <w:sz w:val="24"/>
+          <w:szCs w:val="24"/>
+          <w:lang w:eastAsia="ru-KZ"/>
           <w14:ligatures w14:val="none"/>
         </w:rPr>
-        <w:t>Swagger</w:t>
-      </w:r>
-      <w:proofErr w:type="spellEnd"/>
+      </w:pPr>
       <w:r>
         <w:rPr>
           <w:rFonts w:ascii="Times New Roman" w:eastAsia="Times New Roman" w:hAnsi="Times New Roman" w:cs="Times New Roman"/>
           <w:kern w:val="0"/>
-          <w:sz w:val="28"/>
-          <w:szCs w:val="28"/>
-          <w:lang w:val="ru-KZ" w:eastAsia="ru-KZ"/>
+          <w:sz w:val="24"/>
+          <w:szCs w:val="24"/>
+          <w:lang w:eastAsia="ru-KZ"/>
           <w14:ligatures w14:val="none"/>
         </w:rPr>
-        <w:t xml:space="preserve"> UI</w:t>
-      </w:r>
-    </w:p>
-    <w:p>
-      <w:pPr>
-        <w:pStyle w:val="a7"/>
-        <w:ind w:left="0"/>
+        <w:t>Добавил в сервис OpenAPI, после запуска контейнера перейдите по ссылке ниже:</w:t>
+      </w:r>
+      <w:r>
         <w:rPr>
           <w:rFonts w:ascii="Times New Roman" w:eastAsia="Times New Roman" w:hAnsi="Times New Roman" w:cs="Times New Roman"/>
           <w:kern w:val="0"/>
           <w:sz w:val="24"/>
           <w:szCs w:val="24"/>
-          <w:lang w:val="ru-KZ" w:eastAsia="ru-KZ"/>
-          <w14:ligatures w14:val="none"/>
-        </w:rPr>
-      </w:pPr>
-      <w:r>
-        <w:rPr>
-          <w:rFonts w:ascii="Times New Roman" w:eastAsia="Times New Roman" w:hAnsi="Times New Roman" w:cs="Times New Roman"/>
-          <w:kern w:val="0"/>
-          <w:sz w:val="24"/>
-          <w:szCs w:val="24"/>
-          <w:lang w:val="ru-KZ" w:eastAsia="ru-KZ"/>
-          <w14:ligatures w14:val="none"/>
-        </w:rPr>
-        <w:t xml:space="preserve">Добавил в сервис </w:t>
-      </w:r>
-      <w:proofErr w:type="spellStart"/>
-      <w:r>
-        <w:rPr>
-          <w:rFonts w:ascii="Times New Roman" w:eastAsia="Times New Roman" w:hAnsi="Times New Roman" w:cs="Times New Roman"/>
-          <w:kern w:val="0"/>
-          <w:sz w:val="24"/>
-          <w:szCs w:val="24"/>
-          <w:lang w:val="ru-KZ" w:eastAsia="ru-KZ"/>
-          <w14:ligatures w14:val="none"/>
-        </w:rPr>
-        <w:t>OpenAPI</w:t>
-      </w:r>
-      <w:proofErr w:type="spellEnd"/>
-      <w:r>
-        <w:rPr>
-          <w:rFonts w:ascii="Times New Roman" w:eastAsia="Times New Roman" w:hAnsi="Times New Roman" w:cs="Times New Roman"/>
-          <w:kern w:val="0"/>
-          <w:sz w:val="24"/>
-          <w:szCs w:val="24"/>
-          <w:lang w:val="ru-KZ" w:eastAsia="ru-KZ"/>
-          <w14:ligatures w14:val="none"/>
-        </w:rPr>
-        <w:t>, после запуска контейнера перейдите по ссылке ниже:</w:t>
-      </w:r>
-      <w:r>
-        <w:rPr>
-          <w:rFonts w:ascii="Times New Roman" w:eastAsia="Times New Roman" w:hAnsi="Times New Roman" w:cs="Times New Roman"/>
-          <w:kern w:val="0"/>
-          <w:sz w:val="24"/>
-          <w:szCs w:val="24"/>
-          <w:lang w:val="ru-KZ" w:eastAsia="ru-KZ"/>
+          <w:lang w:eastAsia="ru-KZ"/>
           <w14:ligatures w14:val="none"/>
         </w:rPr>
         <w:br/>
@@ -468,7 +303,7 @@
             <w:kern w:val="0"/>
             <w:sz w:val="24"/>
             <w:szCs w:val="24"/>
-            <w:lang w:val="ru-KZ" w:eastAsia="ru-KZ"/>
+            <w:lang w:eastAsia="ru-KZ"/>
             <w14:ligatures w14:val="none"/>
           </w:rPr>
           <w:t>http://localhost:8080/swagger-ui/index.html</w:t>
@@ -482,9 +317,9 @@
         <w:rPr>
           <w:rFonts w:ascii="Times New Roman" w:eastAsia="Times New Roman" w:hAnsi="Times New Roman" w:cs="Times New Roman"/>
           <w:kern w:val="0"/>
-          <w:sz w:val="24"/>
-          <w:szCs w:val="24"/>
-          <w:lang w:val="ru-KZ" w:eastAsia="ru-KZ"/>
+          <w:sz w:val="28"/>
+          <w:szCs w:val="28"/>
+          <w:lang w:val="ru-RU" w:eastAsia="ru-KZ"/>
           <w14:ligatures w14:val="none"/>
         </w:rPr>
       </w:pPr>
@@ -492,26 +327,155 @@
         <w:rPr>
           <w:rFonts w:ascii="Times New Roman" w:eastAsia="Times New Roman" w:hAnsi="Times New Roman" w:cs="Times New Roman"/>
           <w:kern w:val="0"/>
-          <w:sz w:val="24"/>
-          <w:szCs w:val="24"/>
-          <w:lang w:val="ru-KZ" w:eastAsia="ru-KZ"/>
+          <w:sz w:val="28"/>
+          <w:szCs w:val="28"/>
+          <w:lang w:val="ru-RU" w:eastAsia="ru-KZ"/>
           <w14:ligatures w14:val="none"/>
         </w:rPr>
-        <w:t xml:space="preserve">Доступные </w:t>
-      </w:r>
-      <w:proofErr w:type="spellStart"/>
-      <w:r>
+        <w:t>Авторизация</w:t>
+      </w:r>
+    </w:p>
+    <w:p>
+      <w:pPr>
+        <w:pStyle w:val="a7"/>
+        <w:numPr>
+          <w:ilvl w:val="0"/>
+          <w:numId w:val="9"/>
+        </w:numPr>
         <w:rPr>
           <w:rFonts w:ascii="Times New Roman" w:eastAsia="Times New Roman" w:hAnsi="Times New Roman" w:cs="Times New Roman"/>
           <w:kern w:val="0"/>
           <w:sz w:val="24"/>
           <w:szCs w:val="24"/>
-          <w:lang w:val="ru-KZ" w:eastAsia="ru-KZ"/>
+          <w:lang w:val="ru-RU" w:eastAsia="ru-KZ"/>
           <w14:ligatures w14:val="none"/>
         </w:rPr>
-        <w:t>endpoint:</w:t>
-      </w:r>
-      <w:proofErr w:type="spellEnd"/>
+      </w:pPr>
+      <w:r>
+        <w:rPr>
+          <w:rFonts w:ascii="Times New Roman" w:eastAsia="Times New Roman" w:hAnsi="Times New Roman" w:cs="Times New Roman"/>
+          <w:kern w:val="0"/>
+          <w:sz w:val="24"/>
+          <w:szCs w:val="24"/>
+          <w:lang w:val="ru-RU" w:eastAsia="ru-KZ"/>
+          <w14:ligatures w14:val="none"/>
+        </w:rPr>
+        <w:t xml:space="preserve">Необходимо выполнить запрос </w:t>
+      </w:r>
+      <w:r>
+        <w:rPr>
+          <w:rFonts w:ascii="Times New Roman" w:eastAsia="Times New Roman" w:hAnsi="Times New Roman" w:cs="Times New Roman"/>
+          <w:kern w:val="0"/>
+          <w:sz w:val="24"/>
+          <w:szCs w:val="24"/>
+          <w:lang w:eastAsia="ru-KZ"/>
+          <w14:ligatures w14:val="none"/>
+        </w:rPr>
+        <w:t>POST /api/auth/login с телом {"username": "admin", "password": "admin"}</w:t>
+      </w:r>
+    </w:p>
+    <w:p>
+      <w:pPr>
+        <w:pStyle w:val="a7"/>
+        <w:numPr>
+          <w:ilvl w:val="0"/>
+          <w:numId w:val="9"/>
+        </w:numPr>
+        <w:rPr>
+          <w:rFonts w:ascii="Times New Roman" w:eastAsia="Times New Roman" w:hAnsi="Times New Roman" w:cs="Times New Roman"/>
+          <w:kern w:val="0"/>
+          <w:sz w:val="24"/>
+          <w:szCs w:val="24"/>
+          <w:lang w:val="ru-RU" w:eastAsia="ru-KZ"/>
+          <w14:ligatures w14:val="none"/>
+        </w:rPr>
+      </w:pPr>
+      <w:r>
+        <w:rPr>
+          <w:rFonts w:ascii="Times New Roman" w:eastAsia="Times New Roman" w:hAnsi="Times New Roman" w:cs="Times New Roman"/>
+          <w:kern w:val="0"/>
+          <w:sz w:val="24"/>
+          <w:szCs w:val="24"/>
+          <w:lang w:val="ru-RU" w:eastAsia="ru-KZ"/>
+          <w14:ligatures w14:val="none"/>
+        </w:rPr>
+        <w:t>Скопируйте полученный токен</w:t>
+      </w:r>
+    </w:p>
+    <w:p>
+      <w:pPr>
+        <w:pStyle w:val="a7"/>
+        <w:numPr>
+          <w:ilvl w:val="0"/>
+          <w:numId w:val="9"/>
+        </w:numPr>
+        <w:rPr>
+          <w:rFonts w:ascii="Times New Roman" w:eastAsia="Times New Roman" w:hAnsi="Times New Roman" w:cs="Times New Roman"/>
+          <w:kern w:val="0"/>
+          <w:sz w:val="24"/>
+          <w:szCs w:val="24"/>
+          <w:lang w:val="ru-RU" w:eastAsia="ru-KZ"/>
+          <w14:ligatures w14:val="none"/>
+        </w:rPr>
+      </w:pPr>
+      <w:r>
+        <w:rPr>
+          <w:rFonts w:ascii="Times New Roman" w:eastAsia="Times New Roman" w:hAnsi="Times New Roman" w:cs="Times New Roman"/>
+          <w:kern w:val="0"/>
+          <w:sz w:val="24"/>
+          <w:szCs w:val="24"/>
+          <w:lang w:val="ru-RU" w:eastAsia="ru-KZ"/>
+          <w14:ligatures w14:val="none"/>
+        </w:rPr>
+        <w:t xml:space="preserve">Нажмите кнопку </w:t>
+      </w:r>
+      <w:r>
+        <w:rPr>
+          <w:rFonts w:ascii="Times New Roman" w:eastAsia="Times New Roman" w:hAnsi="Times New Roman" w:cs="Times New Roman"/>
+          <w:kern w:val="0"/>
+          <w:sz w:val="24"/>
+          <w:szCs w:val="24"/>
+          <w:lang w:eastAsia="ru-KZ"/>
+          <w14:ligatures w14:val="none"/>
+        </w:rPr>
+        <w:t>Authorize</w:t>
+      </w:r>
+      <w:r>
+        <w:rPr>
+          <w:rFonts w:ascii="Times New Roman" w:eastAsia="Times New Roman" w:hAnsi="Times New Roman" w:cs="Times New Roman"/>
+          <w:kern w:val="0"/>
+          <w:sz w:val="24"/>
+          <w:szCs w:val="24"/>
+          <w:lang w:val="ru-RU" w:eastAsia="ru-KZ"/>
+          <w14:ligatures w14:val="none"/>
+        </w:rPr>
+        <w:t xml:space="preserve"> и вставьте токен</w:t>
+      </w:r>
+    </w:p>
+    <w:p>
+      <w:pPr>
+        <w:pStyle w:val="a7"/>
+        <w:ind w:left="0"/>
+        <w:rPr>
+          <w:rFonts w:ascii="Times New Roman" w:eastAsia="Times New Roman" w:hAnsi="Times New Roman" w:cs="Times New Roman"/>
+          <w:kern w:val="0"/>
+          <w:sz w:val="28"/>
+          <w:szCs w:val="28"/>
+          <w:lang w:eastAsia="ru-KZ"/>
+          <w14:ligatures w14:val="none"/>
+        </w:rPr>
+      </w:pPr>
+      <w:r>
+        <w:rPr>
+          <w:rFonts w:ascii="Times New Roman" w:eastAsia="Times New Roman" w:hAnsi="Times New Roman" w:cs="Times New Roman"/>
+          <w:kern w:val="0"/>
+          <w:sz w:val="28"/>
+          <w:szCs w:val="28"/>
+          <w:lang w:eastAsia="ru-KZ"/>
+          <w14:ligatures w14:val="none"/>
+        </w:rPr>
+        <w:t>Доступные endpoint:</w:t>
+      </w:r>
     </w:p>
     <w:p>
       <w:pPr>
@@ -525,7 +489,7 @@
           <w:kern w:val="0"/>
           <w:sz w:val="24"/>
           <w:szCs w:val="24"/>
-          <w:lang w:val="ru-KZ" w:eastAsia="ru-KZ"/>
+          <w:lang w:eastAsia="ru-KZ"/>
           <w14:ligatures w14:val="none"/>
         </w:rPr>
       </w:pPr>
@@ -535,48 +499,11 @@
           <w:kern w:val="0"/>
           <w:sz w:val="24"/>
           <w:szCs w:val="24"/>
-          <w:lang w:val="ru-KZ" w:eastAsia="ru-KZ"/>
+          <w:lang w:eastAsia="ru-KZ"/>
           <w14:ligatures w14:val="none"/>
         </w:rPr>
-        <w:t>Проверка ПДФ файла, анализ: метод "POST /</w:t>
-      </w:r>
-      <w:proofErr w:type="spellStart"/>
-      <w:r>
-        <w:rPr>
-          <w:rFonts w:ascii="Times New Roman" w:eastAsia="Times New Roman" w:hAnsi="Times New Roman" w:cs="Times New Roman"/>
-          <w:kern w:val="0"/>
-          <w:sz w:val="24"/>
-          <w:szCs w:val="24"/>
-          <w:lang w:val="ru-KZ" w:eastAsia="ru-KZ"/>
-          <w14:ligatures w14:val="none"/>
-        </w:rPr>
-        <w:t>api</w:t>
-      </w:r>
-      <w:proofErr w:type="spellEnd"/>
-      <w:r>
-        <w:rPr>
-          <w:rFonts w:ascii="Times New Roman" w:eastAsia="Times New Roman" w:hAnsi="Times New Roman" w:cs="Times New Roman"/>
-          <w:kern w:val="0"/>
-          <w:sz w:val="24"/>
-          <w:szCs w:val="24"/>
-          <w:lang w:val="ru-KZ" w:eastAsia="ru-KZ"/>
-          <w14:ligatures w14:val="none"/>
-        </w:rPr>
-        <w:t>/</w:t>
-      </w:r>
-      <w:proofErr w:type="spellStart"/>
-      <w:r>
-        <w:rPr>
-          <w:rFonts w:ascii="Times New Roman" w:eastAsia="Times New Roman" w:hAnsi="Times New Roman" w:cs="Times New Roman"/>
-          <w:kern w:val="0"/>
-          <w:sz w:val="24"/>
-          <w:szCs w:val="24"/>
-          <w:lang w:val="ru-KZ" w:eastAsia="ru-KZ"/>
-          <w14:ligatures w14:val="none"/>
-        </w:rPr>
-        <w:t>pdf-check"</w:t>
-      </w:r>
-      <w:proofErr w:type="spellEnd"/>
+        <w:t>Проверка ПДФ файла, анализ: метод "POST /api/pdf-check"</w:t>
+      </w:r>
     </w:p>
     <w:p>
       <w:pPr>
@@ -586,72 +513,26 @@
           <w:numId w:val="8"/>
         </w:numPr>
         <w:rPr>
+          <w:lang w:val="ru-KZ"/>
+        </w:rPr>
+      </w:pPr>
+      <w:r>
+        <w:rPr>
           <w:rFonts w:ascii="Times New Roman" w:eastAsia="Times New Roman" w:hAnsi="Times New Roman" w:cs="Times New Roman"/>
           <w:kern w:val="0"/>
           <w:sz w:val="24"/>
           <w:szCs w:val="24"/>
-          <w:lang w:val="ru-KZ" w:eastAsia="ru-KZ"/>
+          <w:lang w:eastAsia="ru-KZ"/>
           <w14:ligatures w14:val="none"/>
         </w:rPr>
-      </w:pPr>
-      <w:r>
-        <w:rPr>
-          <w:rFonts w:ascii="Times New Roman" w:eastAsia="Times New Roman" w:hAnsi="Times New Roman" w:cs="Times New Roman"/>
-          <w:kern w:val="0"/>
-          <w:sz w:val="24"/>
-          <w:szCs w:val="24"/>
-          <w:lang w:val="ru-KZ" w:eastAsia="ru-KZ"/>
-          <w14:ligatures w14:val="none"/>
-        </w:rPr>
-        <w:t>Очистка файла: метод "POSR /</w:t>
-      </w:r>
-      <w:proofErr w:type="spellStart"/>
-      <w:r>
-        <w:rPr>
-          <w:rFonts w:ascii="Times New Roman" w:eastAsia="Times New Roman" w:hAnsi="Times New Roman" w:cs="Times New Roman"/>
-          <w:kern w:val="0"/>
-          <w:sz w:val="24"/>
-          <w:szCs w:val="24"/>
-          <w:lang w:val="ru-KZ" w:eastAsia="ru-KZ"/>
-          <w14:ligatures w14:val="none"/>
-        </w:rPr>
-        <w:t>api</w:t>
-      </w:r>
-      <w:proofErr w:type="spellEnd"/>
-      <w:r>
-        <w:rPr>
-          <w:rFonts w:ascii="Times New Roman" w:eastAsia="Times New Roman" w:hAnsi="Times New Roman" w:cs="Times New Roman"/>
-          <w:kern w:val="0"/>
-          <w:sz w:val="24"/>
-          <w:szCs w:val="24"/>
-          <w:lang w:val="ru-KZ" w:eastAsia="ru-KZ"/>
-          <w14:ligatures w14:val="none"/>
-        </w:rPr>
-        <w:t>/</w:t>
-      </w:r>
-      <w:proofErr w:type="spellStart"/>
-      <w:r>
-        <w:rPr>
-          <w:rFonts w:ascii="Times New Roman" w:eastAsia="Times New Roman" w:hAnsi="Times New Roman" w:cs="Times New Roman"/>
-          <w:kern w:val="0"/>
-          <w:sz w:val="24"/>
-          <w:szCs w:val="24"/>
-          <w:lang w:val="ru-KZ" w:eastAsia="ru-KZ"/>
-          <w14:ligatures w14:val="none"/>
-        </w:rPr>
-        <w:t>pdf-sanitize</w:t>
-      </w:r>
-      <w:proofErr w:type="spellEnd"/>
-      <w:r>
-        <w:rPr>
-          <w:rFonts w:ascii="Times New Roman" w:eastAsia="Times New Roman" w:hAnsi="Times New Roman" w:cs="Times New Roman"/>
-          <w:kern w:val="0"/>
-          <w:sz w:val="24"/>
-          <w:szCs w:val="24"/>
-          <w:lang w:val="ru-KZ" w:eastAsia="ru-KZ"/>
-          <w14:ligatures w14:val="none"/>
-        </w:rPr>
-        <w:t>"</w:t>
+        <w:t xml:space="preserve">Скачивание очищенного файла </w:t>
+      </w:r>
+      <w:r>
+        <w:rPr>
+          <w:rFonts w:eastAsia="Times New Roman"/>
+          <w:lang w:val="ru-KZ"/>
+        </w:rPr>
+        <w:t>GET /api/download/{fileName}</w:t>
       </w:r>
     </w:p>
     <w:p>
@@ -714,52 +595,14 @@
           <w:lang w:val="ru-RU"/>
         </w:rPr>
       </w:pPr>
-      <w:proofErr w:type="spellStart"/>
       <w:r>
         <w:rPr>
           <w:rFonts w:cstheme="minorHAnsi"/>
           <w:sz w:val="24"/>
           <w:szCs w:val="24"/>
         </w:rPr>
-        <w:t>docker</w:t>
-      </w:r>
-      <w:proofErr w:type="spellEnd"/>
-      <w:r>
-        <w:rPr>
-          <w:rFonts w:cstheme="minorHAnsi"/>
-          <w:sz w:val="24"/>
-          <w:szCs w:val="24"/>
-        </w:rPr>
-        <w:t xml:space="preserve"> </w:t>
-      </w:r>
-      <w:proofErr w:type="spellStart"/>
-      <w:r>
-        <w:rPr>
-          <w:rFonts w:cstheme="minorHAnsi"/>
-          <w:sz w:val="24"/>
-          <w:szCs w:val="24"/>
-        </w:rPr>
-        <w:t>logs</w:t>
-      </w:r>
-      <w:proofErr w:type="spellEnd"/>
-      <w:r>
-        <w:rPr>
-          <w:rFonts w:cstheme="minorHAnsi"/>
-          <w:sz w:val="24"/>
-          <w:szCs w:val="24"/>
-        </w:rPr>
-        <w:t xml:space="preserve"> </w:t>
-      </w:r>
-      <w:proofErr w:type="spellStart"/>
-      <w:r>
-        <w:rPr>
-          <w:rFonts w:cstheme="minorHAnsi"/>
-          <w:sz w:val="24"/>
-          <w:szCs w:val="24"/>
-        </w:rPr>
-        <w:t>pdf-check-service</w:t>
-      </w:r>
-      <w:proofErr w:type="spellEnd"/>
+        <w:t>docker logs pdf-check-service</w:t>
+      </w:r>
     </w:p>
     <w:p>
       <w:pPr>
@@ -776,43 +619,7 @@
           <w:sz w:val="24"/>
           <w:szCs w:val="24"/>
         </w:rPr>
-        <w:t>Подозрительные файлы сохраняются внутри контейнера по пути /</w:t>
-      </w:r>
-      <w:proofErr w:type="spellStart"/>
-      <w:r>
-        <w:rPr>
-          <w:rFonts w:cstheme="minorHAnsi"/>
-          <w:sz w:val="24"/>
-          <w:szCs w:val="24"/>
-        </w:rPr>
-        <w:t>storage</w:t>
-      </w:r>
-      <w:proofErr w:type="spellEnd"/>
-      <w:r>
-        <w:rPr>
-          <w:rFonts w:cstheme="minorHAnsi"/>
-          <w:sz w:val="24"/>
-          <w:szCs w:val="24"/>
-        </w:rPr>
-        <w:t>/</w:t>
-      </w:r>
-      <w:proofErr w:type="spellStart"/>
-      <w:r>
-        <w:rPr>
-          <w:rFonts w:cstheme="minorHAnsi"/>
-          <w:sz w:val="24"/>
-          <w:szCs w:val="24"/>
-        </w:rPr>
-        <w:t>suspicious</w:t>
-      </w:r>
-      <w:proofErr w:type="spellEnd"/>
-      <w:r>
-        <w:rPr>
-          <w:rFonts w:cstheme="minorHAnsi"/>
-          <w:sz w:val="24"/>
-          <w:szCs w:val="24"/>
-        </w:rPr>
-        <w:t>/</w:t>
+        <w:t>Подозрительные файлы сохраняются внутри контейнера по пути /storage/suspicious/</w:t>
       </w:r>
       <w:r>
         <w:rPr>
@@ -838,107 +645,77 @@
           <w:lang w:val="ru-RU"/>
         </w:rPr>
       </w:pPr>
-      <w:proofErr w:type="spellStart"/>
       <w:r>
         <w:rPr>
           <w:rFonts w:cstheme="minorHAnsi"/>
           <w:sz w:val="24"/>
           <w:szCs w:val="24"/>
         </w:rPr>
-        <w:t>docker</w:t>
-      </w:r>
-      <w:proofErr w:type="spellEnd"/>
+        <w:t>docker cp pdf-check-service:/storage/suspicious/. C:\</w:t>
+      </w:r>
       <w:r>
         <w:rPr>
           <w:rFonts w:cstheme="minorHAnsi"/>
           <w:sz w:val="24"/>
           <w:szCs w:val="24"/>
-        </w:rPr>
-        <w:t xml:space="preserve"> </w:t>
-      </w:r>
-      <w:proofErr w:type="spellStart"/>
-      <w:r>
+          <w:lang w:val="ru-RU"/>
+        </w:rPr>
+        <w:t>ваш_путь</w:t>
+      </w:r>
+    </w:p>
+    <w:p>
+      <w:pPr>
         <w:rPr>
           <w:rFonts w:cstheme="minorHAnsi"/>
           <w:sz w:val="24"/>
           <w:szCs w:val="24"/>
-        </w:rPr>
-        <w:t>cp</w:t>
-      </w:r>
-      <w:proofErr w:type="spellEnd"/>
+          <w:lang w:val="ru-RU"/>
+        </w:rPr>
+      </w:pPr>
       <w:r>
         <w:rPr>
           <w:rFonts w:cstheme="minorHAnsi"/>
           <w:sz w:val="24"/>
           <w:szCs w:val="24"/>
-        </w:rPr>
-        <w:t xml:space="preserve"> </w:t>
-      </w:r>
-      <w:proofErr w:type="spellStart"/>
+          <w:lang w:val="ru-RU"/>
+        </w:rPr>
+        <w:t xml:space="preserve">Подозрительные файлы: </w:t>
+      </w:r>
       <w:r>
         <w:rPr>
           <w:rFonts w:cstheme="minorHAnsi"/>
           <w:sz w:val="24"/>
           <w:szCs w:val="24"/>
         </w:rPr>
-        <w:t>pdf-check-service</w:t>
-      </w:r>
-      <w:proofErr w:type="spellEnd"/>
-      <w:r>
+        <w:t>/storage/suspicious/</w:t>
+      </w:r>
+    </w:p>
+    <w:p>
+      <w:pPr>
         <w:rPr>
           <w:rFonts w:cstheme="minorHAnsi"/>
           <w:sz w:val="24"/>
           <w:szCs w:val="24"/>
-        </w:rPr>
-        <w:t>:/</w:t>
-      </w:r>
-      <w:proofErr w:type="spellStart"/>
+          <w:lang w:val="en-US"/>
+        </w:rPr>
+      </w:pPr>
       <w:r>
         <w:rPr>
           <w:rFonts w:cstheme="minorHAnsi"/>
           <w:sz w:val="24"/>
           <w:szCs w:val="24"/>
-        </w:rPr>
-        <w:t>storage</w:t>
-      </w:r>
-      <w:proofErr w:type="spellEnd"/>
+          <w:lang w:val="ru-RU"/>
+        </w:rPr>
+        <w:t xml:space="preserve">Очищенные файлы: </w:t>
+      </w:r>
       <w:r>
         <w:rPr>
           <w:rFonts w:cstheme="minorHAnsi"/>
           <w:sz w:val="24"/>
           <w:szCs w:val="24"/>
         </w:rPr>
-        <w:t>/</w:t>
-      </w:r>
-      <w:proofErr w:type="spellStart"/>
-      <w:r>
-        <w:rPr>
-          <w:rFonts w:cstheme="minorHAnsi"/>
-          <w:sz w:val="24"/>
-          <w:szCs w:val="24"/>
-        </w:rPr>
-        <w:t>suspicious</w:t>
-      </w:r>
-      <w:proofErr w:type="spellEnd"/>
-      <w:r>
-        <w:rPr>
-          <w:rFonts w:cstheme="minorHAnsi"/>
-          <w:sz w:val="24"/>
-          <w:szCs w:val="24"/>
-        </w:rPr>
-        <w:t>/. C:\</w:t>
-      </w:r>
-      <w:proofErr w:type="spellStart"/>
-      <w:r>
-        <w:rPr>
-          <w:rFonts w:cstheme="minorHAnsi"/>
-          <w:sz w:val="24"/>
-          <w:szCs w:val="24"/>
-          <w:lang w:val="ru-RU"/>
-        </w:rPr>
-        <w:t>ваш_путь</w:t>
-      </w:r>
-      <w:proofErr w:type="spellEnd"/>
+        <w:t>/storage/clean/</w:t>
+      </w:r>
     </w:p>
     <w:sectPr>
       <w:pgSz w:w="11906" w:h="16838"/>
@@ -1523,6 +1300,244 @@
     </w:lvl>
   </w:abstractNum>
   <w:abstractNum w:abstractNumId="6" w15:restartNumberingAfterBreak="0">
+    <w:nsid w:val="5C8C23C9"/>
+    <w:multiLevelType w:val="hybridMultilevel"/>
+    <w:tmpl w:val="47C250A2"/>
+    <w:lvl w:ilvl="0" w:tplc="2000000F">
+      <w:start w:val="1"/>
+      <w:numFmt w:val="decimal"/>
+      <w:lvlText w:val="%1."/>
+      <w:lvlJc w:val="left"/>
+      <w:pPr>
+        <w:ind w:left="720" w:hanging="360"/>
+      </w:pPr>
+      <w:rPr>
+        <w:rFonts w:hint="default"/>
+      </w:rPr>
+    </w:lvl>
+    <w:lvl w:ilvl="1" w:tplc="20000019" w:tentative="1">
+      <w:start w:val="1"/>
+      <w:numFmt w:val="lowerLetter"/>
+      <w:lvlText w:val="%2."/>
+      <w:lvlJc w:val="left"/>
+      <w:pPr>
+        <w:ind w:left="1440" w:hanging="360"/>
+      </w:pPr>
+    </w:lvl>
+    <w:lvl w:ilvl="2" w:tplc="2000001B" w:tentative="1">
+      <w:start w:val="1"/>
+      <w:numFmt w:val="lowerRoman"/>
+      <w:lvlText w:val="%3."/>
+      <w:lvlJc w:val="right"/>
+      <w:pPr>
+        <w:ind w:left="2160" w:hanging="180"/>
+      </w:pPr>
+    </w:lvl>
+    <w:lvl w:ilvl="3" w:tplc="2000000F" w:tentative="1">
+      <w:start w:val="1"/>
+      <w:numFmt w:val="decimal"/>
+      <w:lvlText w:val="%4."/>
+      <w:lvlJc w:val="left"/>
+      <w:pPr>
+        <w:ind w:left="2880" w:hanging="360"/>
+      </w:pPr>
+    </w:lvl>
+    <w:lvl w:ilvl="4" w:tplc="20000019" w:tentative="1">
+      <w:start w:val="1"/>
+      <w:numFmt w:val="lowerLetter"/>
+      <w:lvlText w:val="%5."/>
+      <w:lvlJc w:val="left"/>
+      <w:pPr>
+        <w:ind w:left="3600" w:hanging="360"/>
+      </w:pPr>
+    </w:lvl>
+    <w:lvl w:ilvl="5" w:tplc="2000001B" w:tentative="1">
+      <w:start w:val="1"/>
+      <w:numFmt w:val="lowerRoman"/>
+      <w:lvlText w:val="%6."/>
+      <w:lvlJc w:val="right"/>
+      <w:pPr>
+        <w:ind w:left="4320" w:hanging="180"/>
+      </w:pPr>
+    </w:lvl>
+    <w:lvl w:ilvl="6" w:tplc="2000000F" w:tentative="1">
+      <w:start w:val="1"/>
+      <w:numFmt w:val="decimal"/>
+      <w:lvlText w:val="%7."/>
+      <w:lvlJc w:val="left"/>
+      <w:pPr>
+        <w:ind w:left="5040" w:hanging="360"/>
+      </w:pPr>
+    </w:lvl>
+    <w:lvl w:ilvl="7" w:tplc="20000019" w:tentative="1">
+      <w:start w:val="1"/>
+      <w:numFmt w:val="lowerLetter"/>
+      <w:lvlText w:val="%8."/>
+      <w:lvlJc w:val="left"/>
+      <w:pPr>
+        <w:ind w:left="5760" w:hanging="360"/>
+      </w:pPr>
+    </w:lvl>
+    <w:lvl w:ilvl="8" w:tplc="2000001B" w:tentative="1">
+      <w:start w:val="1"/>
+      <w:numFmt w:val="lowerRoman"/>
+      <w:lvlText w:val="%9."/>
+      <w:lvlJc w:val="right"/>
+      <w:pPr>
+        <w:ind w:left="6480" w:hanging="180"/>
+      </w:pPr>
+    </w:lvl>
+  </w:abstractNum>
+  <w:abstractNum w:abstractNumId="7" w15:restartNumberingAfterBreak="0">
+    <w:nsid w:val="64C233C7"/>
+    <w:multiLevelType w:val="multilevel"/>
+    <w:tmpl w:val="23CE1524"/>
+    <w:lvl w:ilvl="0">
+      <w:start w:val="1"/>
+      <w:numFmt w:val="bullet"/>
+      <w:lvlText w:val=""/>
+      <w:lvlJc w:val="left"/>
+      <w:pPr>
+        <w:tabs>
+          <w:tab w:val="num" w:pos="720"/>
+        </w:tabs>
+        <w:ind w:left="720" w:hanging="360"/>
+      </w:pPr>
+      <w:rPr>
+        <w:rFonts w:ascii="Symbol" w:hAnsi="Symbol" w:hint="default"/>
+        <w:sz w:val="20"/>
+      </w:rPr>
+    </w:lvl>
+    <w:lvl w:ilvl="1" w:tentative="1">
+      <w:start w:val="1"/>
+      <w:numFmt w:val="bullet"/>
+      <w:lvlText w:val="o"/>
+      <w:lvlJc w:val="left"/>
+      <w:pPr>
+        <w:tabs>
+          <w:tab w:val="num" w:pos="1440"/>
+        </w:tabs>
+        <w:ind w:left="1440" w:hanging="360"/>
+      </w:pPr>
+      <w:rPr>
+        <w:rFonts w:ascii="Courier New" w:hAnsi="Courier New" w:hint="default"/>
+        <w:sz w:val="20"/>
+      </w:rPr>
+    </w:lvl>
+    <w:lvl w:ilvl="2" w:tentative="1">
+      <w:start w:val="1"/>
+      <w:numFmt w:val="bullet"/>
+      <w:lvlText w:val=""/>
+      <w:lvlJc w:val="left"/>
+      <w:pPr>
+        <w:tabs>
+          <w:tab w:val="num" w:pos="2160"/>
+        </w:tabs>
+        <w:ind w:left="2160" w:hanging="360"/>
+      </w:pPr>
+      <w:rPr>
+        <w:rFonts w:ascii="Wingdings" w:hAnsi="Wingdings" w:hint="default"/>
+        <w:sz w:val="20"/>
+      </w:rPr>
+    </w:lvl>
+    <w:lvl w:ilvl="3" w:tentative="1">
+      <w:start w:val="1"/>
+      <w:numFmt w:val="bullet"/>
+      <w:lvlText w:val=""/>
+      <w:lvlJc w:val="left"/>
+      <w:pPr>
+        <w:tabs>
+          <w:tab w:val="num" w:pos="2880"/>
+        </w:tabs>
+        <w:ind w:left="2880" w:hanging="360"/>
+      </w:pPr>
+      <w:rPr>
+        <w:rFonts w:ascii="Wingdings" w:hAnsi="Wingdings" w:hint="default"/>
+        <w:sz w:val="20"/>
+      </w:rPr>
+    </w:lvl>
+    <w:lvl w:ilvl="4" w:tentative="1">
+      <w:start w:val="1"/>
+      <w:numFmt w:val="bullet"/>
+      <w:lvlText w:val=""/>
+      <w:lvlJc w:val="left"/>
+      <w:pPr>
+        <w:tabs>
+          <w:tab w:val="num" w:pos="3600"/>
+        </w:tabs>
+        <w:ind w:left="3600" w:hanging="360"/>
+      </w:pPr>
+      <w:rPr>
+        <w:rFonts w:ascii="Wingdings" w:hAnsi="Wingdings" w:hint="default"/>
+        <w:sz w:val="20"/>
+      </w:rPr>
+    </w:lvl>
+    <w:lvl w:ilvl="5" w:tentative="1">
+      <w:start w:val="1"/>
+      <w:numFmt w:val="bullet"/>
+      <w:lvlText w:val=""/>
+      <w:lvlJc w:val="left"/>
+      <w:pPr>
+        <w:tabs>
+          <w:tab w:val="num" w:pos="4320"/>
+        </w:tabs>
+        <w:ind w:left="4320" w:hanging="360"/>
+      </w:pPr>
+      <w:rPr>
+        <w:rFonts w:ascii="Wingdings" w:hAnsi="Wingdings" w:hint="default"/>
+        <w:sz w:val="20"/>
+      </w:rPr>
+    </w:lvl>
+    <w:lvl w:ilvl="6" w:tentative="1">
+      <w:start w:val="1"/>
+      <w:numFmt w:val="bullet"/>
+      <w:lvlText w:val=""/>
+      <w:lvlJc w:val="left"/>
+      <w:pPr>
+        <w:tabs>
+          <w:tab w:val="num" w:pos="5040"/>
+        </w:tabs>
+        <w:ind w:left="5040" w:hanging="360"/>
+      </w:pPr>
+      <w:rPr>
+        <w:rFonts w:ascii="Wingdings" w:hAnsi="Wingdings" w:hint="default"/>
+        <w:sz w:val="20"/>
+      </w:rPr>
+    </w:lvl>
+    <w:lvl w:ilvl="7" w:tentative="1">
+      <w:start w:val="1"/>
+      <w:numFmt w:val="bullet"/>
+      <w:lvlText w:val=""/>
+      <w:lvlJc w:val="left"/>
+      <w:pPr>
+        <w:tabs>
+          <w:tab w:val="num" w:pos="5760"/>
+        </w:tabs>
+        <w:ind w:left="5760" w:hanging="360"/>
+      </w:pPr>
+      <w:rPr>
+        <w:rFonts w:ascii="Wingdings" w:hAnsi="Wingdings" w:hint="default"/>
+        <w:sz w:val="20"/>
+      </w:rPr>
+    </w:lvl>
+    <w:lvl w:ilvl="8" w:tentative="1">
+      <w:start w:val="1"/>
+      <w:numFmt w:val="bullet"/>
+      <w:lvlText w:val=""/>
+      <w:lvlJc w:val="left"/>
+      <w:pPr>
+        <w:tabs>
+          <w:tab w:val="num" w:pos="6480"/>
+        </w:tabs>
+        <w:ind w:left="6480" w:hanging="360"/>
+      </w:pPr>
+      <w:rPr>
+        <w:rFonts w:ascii="Wingdings" w:hAnsi="Wingdings" w:hint="default"/>
+        <w:sz w:val="20"/>
+      </w:rPr>
+    </w:lvl>
+  </w:abstractNum>
+  <w:abstractNum w:abstractNumId="8" w15:restartNumberingAfterBreak="0">
     <w:nsid w:val="6CC521D1"/>
     <w:multiLevelType w:val="hybridMultilevel"/>
     <w:tmpl w:val="158885A6"/>
@@ -1608,7 +1623,7 @@
       </w:pPr>
     </w:lvl>
   </w:abstractNum>
-  <w:abstractNum w:abstractNumId="7" w15:restartNumberingAfterBreak="0">
+  <w:abstractNum w:abstractNumId="9" w15:restartNumberingAfterBreak="0">
     <w:nsid w:val="7EA84492"/>
     <w:multiLevelType w:val="hybridMultilevel"/>
     <w:tmpl w:val="EC4E18FC"/>
@@ -1695,7 +1710,7 @@
     </w:lvl>
   </w:abstractNum>
   <w:num w:numId="1" w16cid:durableId="2002082995">
-    <w:abstractNumId w:val="7"/>
+    <w:abstractNumId w:val="9"/>
   </w:num>
   <w:num w:numId="2" w16cid:durableId="2125877768">
     <w:abstractNumId w:val="4"/>
@@ -1707,7 +1722,7 @@
     <w:abstractNumId w:val="1"/>
   </w:num>
   <w:num w:numId="5" w16cid:durableId="538510755">
-    <w:abstractNumId w:val="6"/>
+    <w:abstractNumId w:val="8"/>
   </w:num>
   <w:num w:numId="6" w16cid:durableId="1139955951">
     <w:abstractNumId w:val="2"/>
@@ -1717,6 +1732,12 @@
   </w:num>
   <w:num w:numId="8" w16cid:durableId="388723698">
     <w:abstractNumId w:val="5"/>
+  </w:num>
+  <w:num w:numId="9" w16cid:durableId="150566013">
+    <w:abstractNumId w:val="6"/>
+  </w:num>
+  <w:num w:numId="10" w16cid:durableId="736172475">
+    <w:abstractNumId w:val="7"/>
   </w:num>
 </w:numbering>
 </file>
@@ -2324,7 +2345,6 @@
   <w:style w:type="character" w:default="1" w:styleId="a0">
     <w:name w:val="Default Paragraph Font"/>
     <w:uiPriority w:val="1"/>
-    <w:semiHidden/>
     <w:unhideWhenUsed/>
   </w:style>
   <w:style w:type="table" w:default="1" w:styleId="a1">

</xml_diff>

<commit_message>
Updateing JWT Access and Refresh token
</commit_message>
<xml_diff>
--- a/Инструкция по запуску.docx
+++ b/Инструкция по запуску.docx
@@ -157,6 +157,7 @@
           <w:szCs w:val="28"/>
         </w:rPr>
       </w:pPr>
+      <w:proofErr w:type="spellStart"/>
       <w:r>
         <w:rPr>
           <w:rFonts w:eastAsia="Times New Roman" w:cstheme="minorHAnsi"/>
@@ -164,7 +165,57 @@
           <w:lang w:eastAsia="ru-KZ"/>
           <w14:ligatures w14:val="none"/>
         </w:rPr>
-        <w:t>docker build -t pdf-check-service .</w:t>
+        <w:t>docker</w:t>
+      </w:r>
+      <w:proofErr w:type="spellEnd"/>
+      <w:r>
+        <w:rPr>
+          <w:rFonts w:eastAsia="Times New Roman" w:cstheme="minorHAnsi"/>
+          <w:kern w:val="0"/>
+          <w:lang w:eastAsia="ru-KZ"/>
+          <w14:ligatures w14:val="none"/>
+        </w:rPr>
+        <w:t xml:space="preserve"> </w:t>
+      </w:r>
+      <w:proofErr w:type="spellStart"/>
+      <w:r>
+        <w:rPr>
+          <w:rFonts w:eastAsia="Times New Roman" w:cstheme="minorHAnsi"/>
+          <w:kern w:val="0"/>
+          <w:lang w:eastAsia="ru-KZ"/>
+          <w14:ligatures w14:val="none"/>
+        </w:rPr>
+        <w:t>build</w:t>
+      </w:r>
+      <w:proofErr w:type="spellEnd"/>
+      <w:r>
+        <w:rPr>
+          <w:rFonts w:eastAsia="Times New Roman" w:cstheme="minorHAnsi"/>
+          <w:kern w:val="0"/>
+          <w:lang w:eastAsia="ru-KZ"/>
+          <w14:ligatures w14:val="none"/>
+        </w:rPr>
+        <w:t xml:space="preserve"> -t </w:t>
+      </w:r>
+      <w:proofErr w:type="spellStart"/>
+      <w:r>
+        <w:rPr>
+          <w:rFonts w:eastAsia="Times New Roman" w:cstheme="minorHAnsi"/>
+          <w:kern w:val="0"/>
+          <w:lang w:eastAsia="ru-KZ"/>
+          <w14:ligatures w14:val="none"/>
+        </w:rPr>
+        <w:t>pdf-check-service</w:t>
+      </w:r>
+      <w:proofErr w:type="spellEnd"/>
+      <w:r>
+        <w:rPr>
+          <w:rFonts w:eastAsia="Times New Roman" w:cstheme="minorHAnsi"/>
+          <w:kern w:val="0"/>
+          <w:lang w:eastAsia="ru-KZ"/>
+          <w14:ligatures w14:val="none"/>
+        </w:rPr>
+        <w:t xml:space="preserve"> .</w:t>
       </w:r>
     </w:p>
     <w:p>
@@ -196,13 +247,79 @@
           <w:lang w:val="en-US"/>
         </w:rPr>
       </w:pPr>
-      <w:r>
-        <w:rPr>
-          <w:sz w:val="24"/>
-          <w:szCs w:val="24"/>
-        </w:rPr>
-        <w:t>docker run -d -p 8080:8080 --name pdf-check-service pdf-check-service</w:t>
-      </w:r>
+      <w:proofErr w:type="spellStart"/>
+      <w:r>
+        <w:rPr>
+          <w:sz w:val="24"/>
+          <w:szCs w:val="24"/>
+        </w:rPr>
+        <w:t>docker</w:t>
+      </w:r>
+      <w:proofErr w:type="spellEnd"/>
+      <w:r>
+        <w:rPr>
+          <w:sz w:val="24"/>
+          <w:szCs w:val="24"/>
+        </w:rPr>
+        <w:t xml:space="preserve"> </w:t>
+      </w:r>
+      <w:proofErr w:type="spellStart"/>
+      <w:r>
+        <w:rPr>
+          <w:sz w:val="24"/>
+          <w:szCs w:val="24"/>
+        </w:rPr>
+        <w:t>run</w:t>
+      </w:r>
+      <w:proofErr w:type="spellEnd"/>
+      <w:r>
+        <w:rPr>
+          <w:sz w:val="24"/>
+          <w:szCs w:val="24"/>
+        </w:rPr>
+        <w:t xml:space="preserve"> -d -p 8080:8080 --</w:t>
+      </w:r>
+      <w:proofErr w:type="spellStart"/>
+      <w:r>
+        <w:rPr>
+          <w:sz w:val="24"/>
+          <w:szCs w:val="24"/>
+        </w:rPr>
+        <w:t>name</w:t>
+      </w:r>
+      <w:proofErr w:type="spellEnd"/>
+      <w:r>
+        <w:rPr>
+          <w:sz w:val="24"/>
+          <w:szCs w:val="24"/>
+        </w:rPr>
+        <w:t xml:space="preserve"> </w:t>
+      </w:r>
+      <w:proofErr w:type="spellStart"/>
+      <w:r>
+        <w:rPr>
+          <w:sz w:val="24"/>
+          <w:szCs w:val="24"/>
+        </w:rPr>
+        <w:t>pdf-check-service</w:t>
+      </w:r>
+      <w:proofErr w:type="spellEnd"/>
+      <w:r>
+        <w:rPr>
+          <w:sz w:val="24"/>
+          <w:szCs w:val="24"/>
+        </w:rPr>
+        <w:t xml:space="preserve"> </w:t>
+      </w:r>
+      <w:proofErr w:type="spellStart"/>
+      <w:r>
+        <w:rPr>
+          <w:sz w:val="24"/>
+          <w:szCs w:val="24"/>
+        </w:rPr>
+        <w:t>pdf-check-service</w:t>
+      </w:r>
+      <w:proofErr w:type="spellEnd"/>
     </w:p>
     <w:p>
       <w:pPr>
@@ -224,7 +341,7 @@
         </w:rPr>
         <w:t xml:space="preserve">Сервис доступен по адресу </w:t>
       </w:r>
-      <w:hyperlink r:id="rId5" w:history="1">
+      <w:hyperlink r:id="rId6" w:history="1">
         <w:r>
           <w:rPr>
             <w:rStyle w:val="ac"/>
@@ -257,7 +374,31 @@
           <w:lang w:eastAsia="ru-KZ"/>
           <w14:ligatures w14:val="none"/>
         </w:rPr>
-        <w:t>Тестирование с помощью Swagger UI</w:t>
+        <w:t xml:space="preserve">Тестирование с помощью </w:t>
+      </w:r>
+      <w:proofErr w:type="spellStart"/>
+      <w:r>
+        <w:rPr>
+          <w:rFonts w:ascii="Times New Roman" w:eastAsia="Times New Roman" w:hAnsi="Times New Roman" w:cs="Times New Roman"/>
+          <w:kern w:val="0"/>
+          <w:sz w:val="28"/>
+          <w:szCs w:val="28"/>
+          <w:lang w:eastAsia="ru-KZ"/>
+          <w14:ligatures w14:val="none"/>
+        </w:rPr>
+        <w:t>Swagger</w:t>
+      </w:r>
+      <w:proofErr w:type="spellEnd"/>
+      <w:r>
+        <w:rPr>
+          <w:rFonts w:ascii="Times New Roman" w:eastAsia="Times New Roman" w:hAnsi="Times New Roman" w:cs="Times New Roman"/>
+          <w:kern w:val="0"/>
+          <w:sz w:val="28"/>
+          <w:szCs w:val="28"/>
+          <w:lang w:eastAsia="ru-KZ"/>
+          <w14:ligatures w14:val="none"/>
+        </w:rPr>
+        <w:t xml:space="preserve"> UI</w:t>
       </w:r>
     </w:p>
     <w:p>
@@ -282,7 +423,31 @@
           <w:lang w:eastAsia="ru-KZ"/>
           <w14:ligatures w14:val="none"/>
         </w:rPr>
-        <w:t>Добавил в сервис OpenAPI, после запуска контейнера перейдите по ссылке ниже:</w:t>
+        <w:t xml:space="preserve">Добавил в сервис </w:t>
+      </w:r>
+      <w:proofErr w:type="spellStart"/>
+      <w:r>
+        <w:rPr>
+          <w:rFonts w:ascii="Times New Roman" w:eastAsia="Times New Roman" w:hAnsi="Times New Roman" w:cs="Times New Roman"/>
+          <w:kern w:val="0"/>
+          <w:sz w:val="24"/>
+          <w:szCs w:val="24"/>
+          <w:lang w:eastAsia="ru-KZ"/>
+          <w14:ligatures w14:val="none"/>
+        </w:rPr>
+        <w:t>OpenAPI</w:t>
+      </w:r>
+      <w:proofErr w:type="spellEnd"/>
+      <w:r>
+        <w:rPr>
+          <w:rFonts w:ascii="Times New Roman" w:eastAsia="Times New Roman" w:hAnsi="Times New Roman" w:cs="Times New Roman"/>
+          <w:kern w:val="0"/>
+          <w:sz w:val="24"/>
+          <w:szCs w:val="24"/>
+          <w:lang w:eastAsia="ru-KZ"/>
+          <w14:ligatures w14:val="none"/>
+        </w:rPr>
+        <w:t>, после запуска контейнера перейдите по ссылке ниже:</w:t>
       </w:r>
       <w:r>
         <w:rPr>
@@ -295,7 +460,7 @@
         </w:rPr>
         <w:br/>
       </w:r>
-      <w:hyperlink r:id="rId6" w:history="1">
+      <w:hyperlink r:id="rId7" w:history="1">
         <w:r>
           <w:rPr>
             <w:rStyle w:val="ac"/>
@@ -371,7 +536,175 @@
           <w:lang w:eastAsia="ru-KZ"/>
           <w14:ligatures w14:val="none"/>
         </w:rPr>
-        <w:t>POST /api/auth/login с телом {"username": "admin", "password": "admin"}</w:t>
+        <w:t>POST /</w:t>
+      </w:r>
+      <w:proofErr w:type="spellStart"/>
+      <w:r>
+        <w:rPr>
+          <w:rFonts w:ascii="Times New Roman" w:eastAsia="Times New Roman" w:hAnsi="Times New Roman" w:cs="Times New Roman"/>
+          <w:kern w:val="0"/>
+          <w:sz w:val="24"/>
+          <w:szCs w:val="24"/>
+          <w:lang w:eastAsia="ru-KZ"/>
+          <w14:ligatures w14:val="none"/>
+        </w:rPr>
+        <w:t>api</w:t>
+      </w:r>
+      <w:proofErr w:type="spellEnd"/>
+      <w:r>
+        <w:rPr>
+          <w:rFonts w:ascii="Times New Roman" w:eastAsia="Times New Roman" w:hAnsi="Times New Roman" w:cs="Times New Roman"/>
+          <w:kern w:val="0"/>
+          <w:sz w:val="24"/>
+          <w:szCs w:val="24"/>
+          <w:lang w:eastAsia="ru-KZ"/>
+          <w14:ligatures w14:val="none"/>
+        </w:rPr>
+        <w:t>/</w:t>
+      </w:r>
+      <w:proofErr w:type="spellStart"/>
+      <w:r>
+        <w:rPr>
+          <w:rFonts w:ascii="Times New Roman" w:eastAsia="Times New Roman" w:hAnsi="Times New Roman" w:cs="Times New Roman"/>
+          <w:kern w:val="0"/>
+          <w:sz w:val="24"/>
+          <w:szCs w:val="24"/>
+          <w:lang w:eastAsia="ru-KZ"/>
+          <w14:ligatures w14:val="none"/>
+        </w:rPr>
+        <w:t>auth</w:t>
+      </w:r>
+      <w:proofErr w:type="spellEnd"/>
+      <w:r>
+        <w:rPr>
+          <w:rFonts w:ascii="Times New Roman" w:eastAsia="Times New Roman" w:hAnsi="Times New Roman" w:cs="Times New Roman"/>
+          <w:kern w:val="0"/>
+          <w:sz w:val="24"/>
+          <w:szCs w:val="24"/>
+          <w:lang w:eastAsia="ru-KZ"/>
+          <w14:ligatures w14:val="none"/>
+        </w:rPr>
+        <w:t>/</w:t>
+      </w:r>
+      <w:proofErr w:type="spellStart"/>
+      <w:r>
+        <w:rPr>
+          <w:rFonts w:ascii="Times New Roman" w:eastAsia="Times New Roman" w:hAnsi="Times New Roman" w:cs="Times New Roman"/>
+          <w:kern w:val="0"/>
+          <w:sz w:val="24"/>
+          <w:szCs w:val="24"/>
+          <w:lang w:eastAsia="ru-KZ"/>
+          <w14:ligatures w14:val="none"/>
+        </w:rPr>
+        <w:t>login</w:t>
+      </w:r>
+      <w:proofErr w:type="spellEnd"/>
+      <w:r>
+        <w:rPr>
+          <w:rFonts w:ascii="Times New Roman" w:eastAsia="Times New Roman" w:hAnsi="Times New Roman" w:cs="Times New Roman"/>
+          <w:kern w:val="0"/>
+          <w:sz w:val="24"/>
+          <w:szCs w:val="24"/>
+          <w:lang w:eastAsia="ru-KZ"/>
+          <w14:ligatures w14:val="none"/>
+        </w:rPr>
+        <w:t xml:space="preserve"> с телом {"</w:t>
+      </w:r>
+      <w:proofErr w:type="spellStart"/>
+      <w:r>
+        <w:rPr>
+          <w:rFonts w:ascii="Times New Roman" w:eastAsia="Times New Roman" w:hAnsi="Times New Roman" w:cs="Times New Roman"/>
+          <w:kern w:val="0"/>
+          <w:sz w:val="24"/>
+          <w:szCs w:val="24"/>
+          <w:lang w:eastAsia="ru-KZ"/>
+          <w14:ligatures w14:val="none"/>
+        </w:rPr>
+        <w:t>username</w:t>
+      </w:r>
+      <w:proofErr w:type="spellEnd"/>
+      <w:r>
+        <w:rPr>
+          <w:rFonts w:ascii="Times New Roman" w:eastAsia="Times New Roman" w:hAnsi="Times New Roman" w:cs="Times New Roman"/>
+          <w:kern w:val="0"/>
+          <w:sz w:val="24"/>
+          <w:szCs w:val="24"/>
+          <w:lang w:eastAsia="ru-KZ"/>
+          <w14:ligatures w14:val="none"/>
+        </w:rPr>
+        <w:t>": "</w:t>
+      </w:r>
+      <w:proofErr w:type="spellStart"/>
+      <w:r>
+        <w:rPr>
+          <w:rFonts w:ascii="Times New Roman" w:eastAsia="Times New Roman" w:hAnsi="Times New Roman" w:cs="Times New Roman"/>
+          <w:kern w:val="0"/>
+          <w:sz w:val="24"/>
+          <w:szCs w:val="24"/>
+          <w:lang w:eastAsia="ru-KZ"/>
+          <w14:ligatures w14:val="none"/>
+        </w:rPr>
+        <w:t>admin</w:t>
+      </w:r>
+      <w:proofErr w:type="spellEnd"/>
+      <w:r>
+        <w:rPr>
+          <w:rFonts w:ascii="Times New Roman" w:eastAsia="Times New Roman" w:hAnsi="Times New Roman" w:cs="Times New Roman"/>
+          <w:kern w:val="0"/>
+          <w:sz w:val="24"/>
+          <w:szCs w:val="24"/>
+          <w:lang w:eastAsia="ru-KZ"/>
+          <w14:ligatures w14:val="none"/>
+        </w:rPr>
+        <w:t>", "</w:t>
+      </w:r>
+      <w:proofErr w:type="spellStart"/>
+      <w:r>
+        <w:rPr>
+          <w:rFonts w:ascii="Times New Roman" w:eastAsia="Times New Roman" w:hAnsi="Times New Roman" w:cs="Times New Roman"/>
+          <w:kern w:val="0"/>
+          <w:sz w:val="24"/>
+          <w:szCs w:val="24"/>
+          <w:lang w:eastAsia="ru-KZ"/>
+          <w14:ligatures w14:val="none"/>
+        </w:rPr>
+        <w:t>password</w:t>
+      </w:r>
+      <w:proofErr w:type="spellEnd"/>
+      <w:r>
+        <w:rPr>
+          <w:rFonts w:ascii="Times New Roman" w:eastAsia="Times New Roman" w:hAnsi="Times New Roman" w:cs="Times New Roman"/>
+          <w:kern w:val="0"/>
+          <w:sz w:val="24"/>
+          <w:szCs w:val="24"/>
+          <w:lang w:eastAsia="ru-KZ"/>
+          <w14:ligatures w14:val="none"/>
+        </w:rPr>
+        <w:t>": "</w:t>
+      </w:r>
+      <w:proofErr w:type="spellStart"/>
+      <w:r>
+        <w:rPr>
+          <w:rFonts w:ascii="Times New Roman" w:eastAsia="Times New Roman" w:hAnsi="Times New Roman" w:cs="Times New Roman"/>
+          <w:kern w:val="0"/>
+          <w:sz w:val="24"/>
+          <w:szCs w:val="24"/>
+          <w:lang w:eastAsia="ru-KZ"/>
+          <w14:ligatures w14:val="none"/>
+        </w:rPr>
+        <w:t>admin</w:t>
+      </w:r>
+      <w:proofErr w:type="spellEnd"/>
+      <w:r>
+        <w:rPr>
+          <w:rFonts w:ascii="Times New Roman" w:eastAsia="Times New Roman" w:hAnsi="Times New Roman" w:cs="Times New Roman"/>
+          <w:kern w:val="0"/>
+          <w:sz w:val="24"/>
+          <w:szCs w:val="24"/>
+          <w:lang w:eastAsia="ru-KZ"/>
+          <w14:ligatures w14:val="none"/>
+        </w:rPr>
+        <w:t>"}</w:t>
       </w:r>
     </w:p>
     <w:p>
@@ -399,7 +732,18 @@
           <w:lang w:val="ru-RU" w:eastAsia="ru-KZ"/>
           <w14:ligatures w14:val="none"/>
         </w:rPr>
-        <w:t>Скопируйте полученный токен</w:t>
+        <w:t xml:space="preserve">Скопируйте полученный </w:t>
+      </w:r>
+      <w:r>
+        <w:rPr>
+          <w:rFonts w:ascii="Times New Roman" w:eastAsia="Times New Roman" w:hAnsi="Times New Roman" w:cs="Times New Roman"/>
+          <w:kern w:val="0"/>
+          <w:sz w:val="24"/>
+          <w:szCs w:val="24"/>
+          <w:lang w:val="en-US" w:eastAsia="ru-KZ"/>
+          <w14:ligatures w14:val="none"/>
+        </w:rPr>
+        <w:t xml:space="preserve">Access token </w:t>
       </w:r>
     </w:p>
     <w:p>
@@ -429,6 +773,7 @@
         </w:rPr>
         <w:t xml:space="preserve">Нажмите кнопку </w:t>
       </w:r>
+      <w:proofErr w:type="spellStart"/>
       <w:r>
         <w:rPr>
           <w:rFonts w:ascii="Times New Roman" w:eastAsia="Times New Roman" w:hAnsi="Times New Roman" w:cs="Times New Roman"/>
@@ -440,6 +785,7 @@
         </w:rPr>
         <w:t>Authorize</w:t>
       </w:r>
+      <w:proofErr w:type="spellEnd"/>
       <w:r>
         <w:rPr>
           <w:rFonts w:ascii="Times New Roman" w:eastAsia="Times New Roman" w:hAnsi="Times New Roman" w:cs="Times New Roman"/>
@@ -449,12 +795,529 @@
           <w:lang w:val="ru-RU" w:eastAsia="ru-KZ"/>
           <w14:ligatures w14:val="none"/>
         </w:rPr>
-        <w:t xml:space="preserve"> и вставьте токен</w:t>
+        <w:t>, вставьте токен и после доступ будет открыт</w:t>
       </w:r>
     </w:p>
     <w:p>
       <w:pPr>
         <w:pStyle w:val="a7"/>
+        <w:numPr>
+          <w:ilvl w:val="0"/>
+          <w:numId w:val="9"/>
+        </w:numPr>
+        <w:rPr>
+          <w:rFonts w:ascii="Times New Roman" w:eastAsia="Times New Roman" w:hAnsi="Times New Roman" w:cs="Times New Roman"/>
+          <w:kern w:val="0"/>
+          <w:sz w:val="24"/>
+          <w:szCs w:val="24"/>
+          <w:lang w:val="ru-RU" w:eastAsia="ru-KZ"/>
+          <w14:ligatures w14:val="none"/>
+        </w:rPr>
+      </w:pPr>
+      <w:r>
+        <w:rPr>
+          <w:rFonts w:ascii="Times New Roman" w:eastAsia="Times New Roman" w:hAnsi="Times New Roman" w:cs="Times New Roman"/>
+          <w:kern w:val="0"/>
+          <w:sz w:val="24"/>
+          <w:szCs w:val="24"/>
+          <w:lang w:val="ru-RU" w:eastAsia="ru-KZ"/>
+          <w14:ligatures w14:val="none"/>
+        </w:rPr>
+        <w:t>Через</w:t>
+      </w:r>
+      <w:r>
+        <w:rPr>
+          <w:rFonts w:ascii="Times New Roman" w:eastAsia="Times New Roman" w:hAnsi="Times New Roman" w:cs="Times New Roman"/>
+          <w:kern w:val="0"/>
+          <w:sz w:val="24"/>
+          <w:szCs w:val="24"/>
+          <w:lang w:val="ru-RU" w:eastAsia="ru-KZ"/>
+          <w14:ligatures w14:val="none"/>
+        </w:rPr>
+        <w:t xml:space="preserve"> 15 </w:t>
+      </w:r>
+      <w:r>
+        <w:rPr>
+          <w:rFonts w:ascii="Times New Roman" w:eastAsia="Times New Roman" w:hAnsi="Times New Roman" w:cs="Times New Roman"/>
+          <w:kern w:val="0"/>
+          <w:sz w:val="24"/>
+          <w:szCs w:val="24"/>
+          <w:lang w:val="ru-RU" w:eastAsia="ru-KZ"/>
+          <w14:ligatures w14:val="none"/>
+        </w:rPr>
+        <w:t>минут</w:t>
+      </w:r>
+      <w:r>
+        <w:rPr>
+          <w:rFonts w:ascii="Times New Roman" w:eastAsia="Times New Roman" w:hAnsi="Times New Roman" w:cs="Times New Roman"/>
+          <w:kern w:val="0"/>
+          <w:sz w:val="24"/>
+          <w:szCs w:val="24"/>
+          <w:lang w:val="ru-RU" w:eastAsia="ru-KZ"/>
+          <w14:ligatures w14:val="none"/>
+        </w:rPr>
+        <w:t xml:space="preserve"> </w:t>
+      </w:r>
+      <w:r>
+        <w:rPr>
+          <w:rFonts w:ascii="Times New Roman" w:eastAsia="Times New Roman" w:hAnsi="Times New Roman" w:cs="Times New Roman"/>
+          <w:kern w:val="0"/>
+          <w:sz w:val="24"/>
+          <w:szCs w:val="24"/>
+          <w:lang w:val="en-US" w:eastAsia="ru-KZ"/>
+          <w14:ligatures w14:val="none"/>
+        </w:rPr>
+        <w:t>access</w:t>
+      </w:r>
+      <w:r>
+        <w:rPr>
+          <w:rFonts w:ascii="Times New Roman" w:eastAsia="Times New Roman" w:hAnsi="Times New Roman" w:cs="Times New Roman"/>
+          <w:kern w:val="0"/>
+          <w:sz w:val="24"/>
+          <w:szCs w:val="24"/>
+          <w:lang w:val="ru-RU" w:eastAsia="ru-KZ"/>
+          <w14:ligatures w14:val="none"/>
+        </w:rPr>
+        <w:t xml:space="preserve"> </w:t>
+      </w:r>
+      <w:r>
+        <w:rPr>
+          <w:rFonts w:ascii="Times New Roman" w:eastAsia="Times New Roman" w:hAnsi="Times New Roman" w:cs="Times New Roman"/>
+          <w:kern w:val="0"/>
+          <w:sz w:val="24"/>
+          <w:szCs w:val="24"/>
+          <w:lang w:val="en-US" w:eastAsia="ru-KZ"/>
+          <w14:ligatures w14:val="none"/>
+        </w:rPr>
+        <w:t>token</w:t>
+      </w:r>
+      <w:r>
+        <w:rPr>
+          <w:rFonts w:ascii="Times New Roman" w:eastAsia="Times New Roman" w:hAnsi="Times New Roman" w:cs="Times New Roman"/>
+          <w:kern w:val="0"/>
+          <w:sz w:val="24"/>
+          <w:szCs w:val="24"/>
+          <w:lang w:val="ru-RU" w:eastAsia="ru-KZ"/>
+          <w14:ligatures w14:val="none"/>
+        </w:rPr>
+        <w:t xml:space="preserve"> </w:t>
+      </w:r>
+      <w:r>
+        <w:rPr>
+          <w:rFonts w:ascii="Times New Roman" w:eastAsia="Times New Roman" w:hAnsi="Times New Roman" w:cs="Times New Roman"/>
+          <w:kern w:val="0"/>
+          <w:sz w:val="24"/>
+          <w:szCs w:val="24"/>
+          <w:lang w:val="ru-RU" w:eastAsia="ru-KZ"/>
+          <w14:ligatures w14:val="none"/>
+        </w:rPr>
+        <w:t xml:space="preserve">будет недействительным, для его обновления нужно будет перейти к </w:t>
+      </w:r>
+      <w:proofErr w:type="spellStart"/>
+      <w:r>
+        <w:rPr>
+          <w:rFonts w:ascii="Times New Roman" w:eastAsia="Times New Roman" w:hAnsi="Times New Roman" w:cs="Times New Roman"/>
+          <w:kern w:val="0"/>
+          <w:sz w:val="24"/>
+          <w:szCs w:val="24"/>
+          <w:lang w:val="ru-RU" w:eastAsia="ru-KZ"/>
+          <w14:ligatures w14:val="none"/>
+        </w:rPr>
+        <w:t>эндпоинту</w:t>
+      </w:r>
+      <w:proofErr w:type="spellEnd"/>
+      <w:r>
+        <w:rPr>
+          <w:rFonts w:ascii="Times New Roman" w:eastAsia="Times New Roman" w:hAnsi="Times New Roman" w:cs="Times New Roman"/>
+          <w:kern w:val="0"/>
+          <w:sz w:val="24"/>
+          <w:szCs w:val="24"/>
+          <w:lang w:val="ru-RU" w:eastAsia="ru-KZ"/>
+          <w14:ligatures w14:val="none"/>
+        </w:rPr>
+        <w:t xml:space="preserve"> </w:t>
+      </w:r>
+      <w:r>
+        <w:rPr>
+          <w:rFonts w:ascii="Times New Roman" w:eastAsia="Times New Roman" w:hAnsi="Times New Roman" w:cs="Times New Roman"/>
+          <w:kern w:val="0"/>
+          <w:sz w:val="24"/>
+          <w:szCs w:val="24"/>
+          <w:lang w:val="en-US" w:eastAsia="ru-KZ"/>
+          <w14:ligatures w14:val="none"/>
+        </w:rPr>
+        <w:t>POST</w:t>
+      </w:r>
+      <w:r>
+        <w:rPr>
+          <w:rFonts w:ascii="Times New Roman" w:eastAsia="Times New Roman" w:hAnsi="Times New Roman" w:cs="Times New Roman"/>
+          <w:kern w:val="0"/>
+          <w:sz w:val="24"/>
+          <w:szCs w:val="24"/>
+          <w:lang w:val="ru-RU" w:eastAsia="ru-KZ"/>
+          <w14:ligatures w14:val="none"/>
+        </w:rPr>
+        <w:t xml:space="preserve"> /</w:t>
+      </w:r>
+      <w:proofErr w:type="spellStart"/>
+      <w:r>
+        <w:rPr>
+          <w:rFonts w:ascii="Times New Roman" w:eastAsia="Times New Roman" w:hAnsi="Times New Roman" w:cs="Times New Roman"/>
+          <w:kern w:val="0"/>
+          <w:sz w:val="24"/>
+          <w:szCs w:val="24"/>
+          <w:lang w:val="en-US" w:eastAsia="ru-KZ"/>
+          <w14:ligatures w14:val="none"/>
+        </w:rPr>
+        <w:t>api</w:t>
+      </w:r>
+      <w:proofErr w:type="spellEnd"/>
+      <w:r>
+        <w:rPr>
+          <w:rFonts w:ascii="Times New Roman" w:eastAsia="Times New Roman" w:hAnsi="Times New Roman" w:cs="Times New Roman"/>
+          <w:kern w:val="0"/>
+          <w:sz w:val="24"/>
+          <w:szCs w:val="24"/>
+          <w:lang w:val="ru-RU" w:eastAsia="ru-KZ"/>
+          <w14:ligatures w14:val="none"/>
+        </w:rPr>
+        <w:t>/</w:t>
+      </w:r>
+      <w:r>
+        <w:rPr>
+          <w:rFonts w:ascii="Times New Roman" w:eastAsia="Times New Roman" w:hAnsi="Times New Roman" w:cs="Times New Roman"/>
+          <w:kern w:val="0"/>
+          <w:sz w:val="24"/>
+          <w:szCs w:val="24"/>
+          <w:lang w:val="en-US" w:eastAsia="ru-KZ"/>
+          <w14:ligatures w14:val="none"/>
+        </w:rPr>
+        <w:t>auth</w:t>
+      </w:r>
+      <w:r>
+        <w:rPr>
+          <w:rFonts w:ascii="Times New Roman" w:eastAsia="Times New Roman" w:hAnsi="Times New Roman" w:cs="Times New Roman"/>
+          <w:kern w:val="0"/>
+          <w:sz w:val="24"/>
+          <w:szCs w:val="24"/>
+          <w:lang w:val="ru-RU" w:eastAsia="ru-KZ"/>
+          <w14:ligatures w14:val="none"/>
+        </w:rPr>
+        <w:t>/</w:t>
+      </w:r>
+      <w:r>
+        <w:rPr>
+          <w:rFonts w:ascii="Times New Roman" w:eastAsia="Times New Roman" w:hAnsi="Times New Roman" w:cs="Times New Roman"/>
+          <w:kern w:val="0"/>
+          <w:sz w:val="24"/>
+          <w:szCs w:val="24"/>
+          <w:lang w:val="en-US" w:eastAsia="ru-KZ"/>
+          <w14:ligatures w14:val="none"/>
+        </w:rPr>
+        <w:t>refresh</w:t>
+      </w:r>
+    </w:p>
+    <w:p>
+      <w:pPr>
+        <w:pStyle w:val="a7"/>
+        <w:numPr>
+          <w:ilvl w:val="0"/>
+          <w:numId w:val="9"/>
+        </w:numPr>
+        <w:rPr>
+          <w:rFonts w:ascii="Times New Roman" w:eastAsia="Times New Roman" w:hAnsi="Times New Roman" w:cs="Times New Roman"/>
+          <w:kern w:val="0"/>
+          <w:sz w:val="24"/>
+          <w:szCs w:val="24"/>
+          <w:lang w:val="ru-RU" w:eastAsia="ru-KZ"/>
+          <w14:ligatures w14:val="none"/>
+        </w:rPr>
+      </w:pPr>
+      <w:r>
+        <w:rPr>
+          <w:rFonts w:ascii="Times New Roman" w:eastAsia="Times New Roman" w:hAnsi="Times New Roman" w:cs="Times New Roman"/>
+          <w:kern w:val="0"/>
+          <w:sz w:val="24"/>
+          <w:szCs w:val="24"/>
+          <w:lang w:val="ru-RU" w:eastAsia="ru-KZ"/>
+          <w14:ligatures w14:val="none"/>
+        </w:rPr>
+        <w:t xml:space="preserve">Ранее полученный </w:t>
+      </w:r>
+      <w:r>
+        <w:rPr>
+          <w:rFonts w:ascii="Times New Roman" w:eastAsia="Times New Roman" w:hAnsi="Times New Roman" w:cs="Times New Roman"/>
+          <w:kern w:val="0"/>
+          <w:sz w:val="24"/>
+          <w:szCs w:val="24"/>
+          <w:lang w:val="en-US" w:eastAsia="ru-KZ"/>
+          <w14:ligatures w14:val="none"/>
+        </w:rPr>
+        <w:t>refresh</w:t>
+      </w:r>
+      <w:r>
+        <w:rPr>
+          <w:rFonts w:ascii="Times New Roman" w:eastAsia="Times New Roman" w:hAnsi="Times New Roman" w:cs="Times New Roman"/>
+          <w:kern w:val="0"/>
+          <w:sz w:val="24"/>
+          <w:szCs w:val="24"/>
+          <w:lang w:val="ru-RU" w:eastAsia="ru-KZ"/>
+          <w14:ligatures w14:val="none"/>
+        </w:rPr>
+        <w:t xml:space="preserve"> </w:t>
+      </w:r>
+      <w:r>
+        <w:rPr>
+          <w:rFonts w:ascii="Times New Roman" w:eastAsia="Times New Roman" w:hAnsi="Times New Roman" w:cs="Times New Roman"/>
+          <w:kern w:val="0"/>
+          <w:sz w:val="24"/>
+          <w:szCs w:val="24"/>
+          <w:lang w:val="en-US" w:eastAsia="ru-KZ"/>
+          <w14:ligatures w14:val="none"/>
+        </w:rPr>
+        <w:t>token</w:t>
+      </w:r>
+      <w:r>
+        <w:rPr>
+          <w:rFonts w:ascii="Times New Roman" w:eastAsia="Times New Roman" w:hAnsi="Times New Roman" w:cs="Times New Roman"/>
+          <w:kern w:val="0"/>
+          <w:sz w:val="24"/>
+          <w:szCs w:val="24"/>
+          <w:lang w:val="ru-RU" w:eastAsia="ru-KZ"/>
+          <w14:ligatures w14:val="none"/>
+        </w:rPr>
+        <w:t xml:space="preserve"> </w:t>
+      </w:r>
+      <w:r>
+        <w:rPr>
+          <w:rFonts w:ascii="Times New Roman" w:eastAsia="Times New Roman" w:hAnsi="Times New Roman" w:cs="Times New Roman"/>
+          <w:kern w:val="0"/>
+          <w:sz w:val="24"/>
+          <w:szCs w:val="24"/>
+          <w:lang w:val="ru-RU" w:eastAsia="ru-KZ"/>
+          <w14:ligatures w14:val="none"/>
+        </w:rPr>
+        <w:t xml:space="preserve">нужно будет вставить в </w:t>
+      </w:r>
+      <w:r>
+        <w:rPr>
+          <w:rFonts w:ascii="Times New Roman" w:eastAsia="Times New Roman" w:hAnsi="Times New Roman" w:cs="Times New Roman"/>
+          <w:kern w:val="0"/>
+          <w:sz w:val="24"/>
+          <w:szCs w:val="24"/>
+          <w:lang w:val="en-US" w:eastAsia="ru-KZ"/>
+          <w14:ligatures w14:val="none"/>
+        </w:rPr>
+        <w:t>request</w:t>
+      </w:r>
+      <w:r>
+        <w:rPr>
+          <w:rFonts w:ascii="Times New Roman" w:eastAsia="Times New Roman" w:hAnsi="Times New Roman" w:cs="Times New Roman"/>
+          <w:kern w:val="0"/>
+          <w:sz w:val="24"/>
+          <w:szCs w:val="24"/>
+          <w:lang w:val="ru-RU" w:eastAsia="ru-KZ"/>
+          <w14:ligatures w14:val="none"/>
+        </w:rPr>
+        <w:t xml:space="preserve"> </w:t>
+      </w:r>
+      <w:r>
+        <w:rPr>
+          <w:rFonts w:ascii="Times New Roman" w:eastAsia="Times New Roman" w:hAnsi="Times New Roman" w:cs="Times New Roman"/>
+          <w:kern w:val="0"/>
+          <w:sz w:val="24"/>
+          <w:szCs w:val="24"/>
+          <w:lang w:val="en-US" w:eastAsia="ru-KZ"/>
+          <w14:ligatures w14:val="none"/>
+        </w:rPr>
+        <w:t>body</w:t>
+      </w:r>
+      <w:r>
+        <w:rPr>
+          <w:rFonts w:ascii="Times New Roman" w:eastAsia="Times New Roman" w:hAnsi="Times New Roman" w:cs="Times New Roman"/>
+          <w:kern w:val="0"/>
+          <w:sz w:val="24"/>
+          <w:szCs w:val="24"/>
+          <w:lang w:val="ru-RU" w:eastAsia="ru-KZ"/>
+          <w14:ligatures w14:val="none"/>
+        </w:rPr>
+        <w:t xml:space="preserve">: </w:t>
+      </w:r>
+      <w:r>
+        <w:rPr>
+          <w:rFonts w:ascii="Times New Roman" w:eastAsia="Times New Roman" w:hAnsi="Times New Roman" w:cs="Times New Roman"/>
+          <w:kern w:val="0"/>
+          <w:sz w:val="24"/>
+          <w:szCs w:val="24"/>
+          <w:lang w:val="ru-RU" w:eastAsia="ru-KZ"/>
+          <w14:ligatures w14:val="none"/>
+        </w:rPr>
+        <w:br/>
+      </w:r>
+      <w:r>
+        <w:rPr>
+          <w:rFonts w:ascii="Times New Roman" w:eastAsia="Times New Roman" w:hAnsi="Times New Roman" w:cs="Times New Roman"/>
+          <w:kern w:val="0"/>
+          <w:sz w:val="24"/>
+          <w:szCs w:val="24"/>
+          <w:lang w:val="ru-RU" w:eastAsia="ru-KZ"/>
+          <w14:ligatures w14:val="none"/>
+        </w:rPr>
+        <w:t>{</w:t>
+      </w:r>
+    </w:p>
+    <w:p>
+      <w:pPr>
+        <w:pStyle w:val="a7"/>
+        <w:rPr>
+          <w:rFonts w:ascii="Times New Roman" w:eastAsia="Times New Roman" w:hAnsi="Times New Roman" w:cs="Times New Roman"/>
+          <w:kern w:val="0"/>
+          <w:sz w:val="24"/>
+          <w:szCs w:val="24"/>
+          <w:lang w:val="en-US" w:eastAsia="ru-KZ"/>
+          <w14:ligatures w14:val="none"/>
+        </w:rPr>
+      </w:pPr>
+      <w:r>
+        <w:rPr>
+          <w:rFonts w:ascii="Times New Roman" w:eastAsia="Times New Roman" w:hAnsi="Times New Roman" w:cs="Times New Roman"/>
+          <w:kern w:val="0"/>
+          <w:sz w:val="24"/>
+          <w:szCs w:val="24"/>
+          <w:lang w:val="ru-RU" w:eastAsia="ru-KZ"/>
+          <w14:ligatures w14:val="none"/>
+        </w:rPr>
+        <w:t xml:space="preserve"> "</w:t>
+      </w:r>
+      <w:proofErr w:type="spellStart"/>
+      <w:r>
+        <w:rPr>
+          <w:rFonts w:ascii="Times New Roman" w:eastAsia="Times New Roman" w:hAnsi="Times New Roman" w:cs="Times New Roman"/>
+          <w:kern w:val="0"/>
+          <w:sz w:val="24"/>
+          <w:szCs w:val="24"/>
+          <w:lang w:val="ru-RU" w:eastAsia="ru-KZ"/>
+          <w14:ligatures w14:val="none"/>
+        </w:rPr>
+        <w:t>refreshToken</w:t>
+      </w:r>
+      <w:proofErr w:type="spellEnd"/>
+      <w:r>
+        <w:rPr>
+          <w:rFonts w:ascii="Times New Roman" w:eastAsia="Times New Roman" w:hAnsi="Times New Roman" w:cs="Times New Roman"/>
+          <w:kern w:val="0"/>
+          <w:sz w:val="24"/>
+          <w:szCs w:val="24"/>
+          <w:lang w:val="ru-RU" w:eastAsia="ru-KZ"/>
+          <w14:ligatures w14:val="none"/>
+        </w:rPr>
+        <w:t>":</w:t>
+      </w:r>
+      <w:r>
+        <w:rPr>
+          <w:rFonts w:ascii="Times New Roman" w:eastAsia="Times New Roman" w:hAnsi="Times New Roman" w:cs="Times New Roman"/>
+          <w:kern w:val="0"/>
+          <w:sz w:val="24"/>
+          <w:szCs w:val="24"/>
+          <w:lang w:val="ru-RU" w:eastAsia="ru-KZ"/>
+          <w14:ligatures w14:val="none"/>
+        </w:rPr>
+        <w:t xml:space="preserve"> </w:t>
+      </w:r>
+      <w:r>
+        <w:rPr>
+          <w:rFonts w:ascii="Times New Roman" w:eastAsia="Times New Roman" w:hAnsi="Times New Roman" w:cs="Times New Roman"/>
+          <w:kern w:val="0"/>
+          <w:sz w:val="24"/>
+          <w:szCs w:val="24"/>
+          <w:lang w:val="ru-RU" w:eastAsia="ru-KZ"/>
+          <w14:ligatures w14:val="none"/>
+        </w:rPr>
+        <w:t>"</w:t>
+      </w:r>
+      <w:r>
+        <w:rPr>
+          <w:rFonts w:ascii="Times New Roman" w:eastAsia="Times New Roman" w:hAnsi="Times New Roman" w:cs="Times New Roman"/>
+          <w:kern w:val="0"/>
+          <w:sz w:val="24"/>
+          <w:szCs w:val="24"/>
+          <w:lang w:val="kk-KZ" w:eastAsia="ru-KZ"/>
+          <w14:ligatures w14:val="none"/>
+        </w:rPr>
+        <w:t>здесь вставить скопированный рефреш токен</w:t>
+      </w:r>
+      <w:r>
+        <w:rPr>
+          <w:rFonts w:ascii="Times New Roman" w:eastAsia="Times New Roman" w:hAnsi="Times New Roman" w:cs="Times New Roman"/>
+          <w:kern w:val="0"/>
+          <w:sz w:val="24"/>
+          <w:szCs w:val="24"/>
+          <w:lang w:val="ru-RU" w:eastAsia="ru-KZ"/>
+          <w14:ligatures w14:val="none"/>
+        </w:rPr>
+        <w:t>"</w:t>
+      </w:r>
+    </w:p>
+    <w:p>
+      <w:pPr>
+        <w:pStyle w:val="a7"/>
+        <w:rPr>
+          <w:rFonts w:ascii="Times New Roman" w:eastAsia="Times New Roman" w:hAnsi="Times New Roman" w:cs="Times New Roman"/>
+          <w:kern w:val="0"/>
+          <w:sz w:val="24"/>
+          <w:szCs w:val="24"/>
+          <w:lang w:val="ru-RU" w:eastAsia="ru-KZ"/>
+          <w14:ligatures w14:val="none"/>
+        </w:rPr>
+      </w:pPr>
+      <w:r>
+        <w:rPr>
+          <w:rFonts w:ascii="Times New Roman" w:eastAsia="Times New Roman" w:hAnsi="Times New Roman" w:cs="Times New Roman"/>
+          <w:kern w:val="0"/>
+          <w:sz w:val="24"/>
+          <w:szCs w:val="24"/>
+          <w:lang w:val="ru-RU" w:eastAsia="ru-KZ"/>
+          <w14:ligatures w14:val="none"/>
+        </w:rPr>
+        <w:t>}</w:t>
+      </w:r>
+      <w:r>
+        <w:rPr>
+          <w:rFonts w:ascii="Times New Roman" w:eastAsia="Times New Roman" w:hAnsi="Times New Roman" w:cs="Times New Roman"/>
+          <w:kern w:val="0"/>
+          <w:sz w:val="24"/>
+          <w:szCs w:val="24"/>
+          <w:lang w:val="ru-RU" w:eastAsia="ru-KZ"/>
+          <w14:ligatures w14:val="none"/>
+        </w:rPr>
+        <w:t xml:space="preserve"> и нажмите </w:t>
+      </w:r>
+      <w:r>
+        <w:rPr>
+          <w:rFonts w:ascii="Times New Roman" w:eastAsia="Times New Roman" w:hAnsi="Times New Roman" w:cs="Times New Roman"/>
+          <w:kern w:val="0"/>
+          <w:sz w:val="24"/>
+          <w:szCs w:val="24"/>
+          <w:lang w:val="en-US" w:eastAsia="ru-KZ"/>
+          <w14:ligatures w14:val="none"/>
+        </w:rPr>
+        <w:t>execute</w:t>
+      </w:r>
+      <w:r>
+        <w:rPr>
+          <w:rFonts w:ascii="Times New Roman" w:eastAsia="Times New Roman" w:hAnsi="Times New Roman" w:cs="Times New Roman"/>
+          <w:kern w:val="0"/>
+          <w:sz w:val="24"/>
+          <w:szCs w:val="24"/>
+          <w:lang w:val="ru-RU" w:eastAsia="ru-KZ"/>
+          <w14:ligatures w14:val="none"/>
+        </w:rPr>
+        <w:t xml:space="preserve"> </w:t>
+      </w:r>
+    </w:p>
+    <w:p>
+      <w:pPr>
+        <w:pStyle w:val="a7"/>
         <w:ind w:left="0"/>
         <w:rPr>
           <w:rFonts w:ascii="Times New Roman" w:eastAsia="Times New Roman" w:hAnsi="Times New Roman" w:cs="Times New Roman"/>
@@ -474,7 +1337,31 @@
           <w:lang w:eastAsia="ru-KZ"/>
           <w14:ligatures w14:val="none"/>
         </w:rPr>
-        <w:t>Доступные endpoint:</w:t>
+        <w:t xml:space="preserve">Доступные </w:t>
+      </w:r>
+      <w:proofErr w:type="spellStart"/>
+      <w:r>
+        <w:rPr>
+          <w:rFonts w:ascii="Times New Roman" w:eastAsia="Times New Roman" w:hAnsi="Times New Roman" w:cs="Times New Roman"/>
+          <w:kern w:val="0"/>
+          <w:sz w:val="28"/>
+          <w:szCs w:val="28"/>
+          <w:lang w:eastAsia="ru-KZ"/>
+          <w14:ligatures w14:val="none"/>
+        </w:rPr>
+        <w:t>endpoint</w:t>
+      </w:r>
+      <w:proofErr w:type="spellEnd"/>
+      <w:r>
+        <w:rPr>
+          <w:rFonts w:ascii="Times New Roman" w:eastAsia="Times New Roman" w:hAnsi="Times New Roman" w:cs="Times New Roman"/>
+          <w:kern w:val="0"/>
+          <w:sz w:val="28"/>
+          <w:szCs w:val="28"/>
+          <w:lang w:eastAsia="ru-KZ"/>
+          <w14:ligatures w14:val="none"/>
+        </w:rPr>
+        <w:t>:</w:t>
       </w:r>
     </w:p>
     <w:p>
@@ -502,7 +1389,55 @@
           <w:lang w:eastAsia="ru-KZ"/>
           <w14:ligatures w14:val="none"/>
         </w:rPr>
-        <w:t>Проверка ПДФ файла, анализ: метод "POST /api/pdf-check"</w:t>
+        <w:t>Проверка ПДФ файла, анализ: метод "POST /</w:t>
+      </w:r>
+      <w:proofErr w:type="spellStart"/>
+      <w:r>
+        <w:rPr>
+          <w:rFonts w:ascii="Times New Roman" w:eastAsia="Times New Roman" w:hAnsi="Times New Roman" w:cs="Times New Roman"/>
+          <w:kern w:val="0"/>
+          <w:sz w:val="24"/>
+          <w:szCs w:val="24"/>
+          <w:lang w:eastAsia="ru-KZ"/>
+          <w14:ligatures w14:val="none"/>
+        </w:rPr>
+        <w:t>api</w:t>
+      </w:r>
+      <w:proofErr w:type="spellEnd"/>
+      <w:r>
+        <w:rPr>
+          <w:rFonts w:ascii="Times New Roman" w:eastAsia="Times New Roman" w:hAnsi="Times New Roman" w:cs="Times New Roman"/>
+          <w:kern w:val="0"/>
+          <w:sz w:val="24"/>
+          <w:szCs w:val="24"/>
+          <w:lang w:eastAsia="ru-KZ"/>
+          <w14:ligatures w14:val="none"/>
+        </w:rPr>
+        <w:t>/</w:t>
+      </w:r>
+      <w:proofErr w:type="spellStart"/>
+      <w:r>
+        <w:rPr>
+          <w:rFonts w:ascii="Times New Roman" w:eastAsia="Times New Roman" w:hAnsi="Times New Roman" w:cs="Times New Roman"/>
+          <w:kern w:val="0"/>
+          <w:sz w:val="24"/>
+          <w:szCs w:val="24"/>
+          <w:lang w:eastAsia="ru-KZ"/>
+          <w14:ligatures w14:val="none"/>
+        </w:rPr>
+        <w:t>pdf-check</w:t>
+      </w:r>
+      <w:proofErr w:type="spellEnd"/>
+      <w:r>
+        <w:rPr>
+          <w:rFonts w:ascii="Times New Roman" w:eastAsia="Times New Roman" w:hAnsi="Times New Roman" w:cs="Times New Roman"/>
+          <w:kern w:val="0"/>
+          <w:sz w:val="24"/>
+          <w:szCs w:val="24"/>
+          <w:lang w:eastAsia="ru-KZ"/>
+          <w14:ligatures w14:val="none"/>
+        </w:rPr>
+        <w:t>"</w:t>
       </w:r>
     </w:p>
     <w:p>
@@ -513,7 +1448,286 @@
           <w:numId w:val="8"/>
         </w:numPr>
         <w:rPr>
-          <w:lang w:val="ru-KZ"/>
+          <w:rFonts w:ascii="Times New Roman" w:eastAsia="Times New Roman" w:hAnsi="Times New Roman" w:cs="Times New Roman"/>
+          <w:kern w:val="0"/>
+          <w:sz w:val="24"/>
+          <w:szCs w:val="24"/>
+          <w:lang w:eastAsia="ru-KZ"/>
+          <w14:ligatures w14:val="none"/>
+        </w:rPr>
+      </w:pPr>
+      <w:r>
+        <w:rPr>
+          <w:rFonts w:ascii="Times New Roman" w:eastAsia="Times New Roman" w:hAnsi="Times New Roman" w:cs="Times New Roman"/>
+          <w:kern w:val="0"/>
+          <w:sz w:val="24"/>
+          <w:szCs w:val="24"/>
+          <w:lang w:val="ru-RU" w:eastAsia="ru-KZ"/>
+          <w14:ligatures w14:val="none"/>
+        </w:rPr>
+        <w:t xml:space="preserve">Авторизация пользователя: </w:t>
+      </w:r>
+      <w:r>
+        <w:rPr>
+          <w:rFonts w:ascii="Times New Roman" w:eastAsia="Times New Roman" w:hAnsi="Times New Roman" w:cs="Times New Roman"/>
+          <w:kern w:val="0"/>
+          <w:sz w:val="24"/>
+          <w:szCs w:val="24"/>
+          <w:lang w:eastAsia="ru-KZ"/>
+          <w14:ligatures w14:val="none"/>
+        </w:rPr>
+        <w:t>POST /</w:t>
+      </w:r>
+      <w:proofErr w:type="spellStart"/>
+      <w:r>
+        <w:rPr>
+          <w:rFonts w:ascii="Times New Roman" w:eastAsia="Times New Roman" w:hAnsi="Times New Roman" w:cs="Times New Roman"/>
+          <w:kern w:val="0"/>
+          <w:sz w:val="24"/>
+          <w:szCs w:val="24"/>
+          <w:lang w:eastAsia="ru-KZ"/>
+          <w14:ligatures w14:val="none"/>
+        </w:rPr>
+        <w:t>api</w:t>
+      </w:r>
+      <w:proofErr w:type="spellEnd"/>
+      <w:r>
+        <w:rPr>
+          <w:rFonts w:ascii="Times New Roman" w:eastAsia="Times New Roman" w:hAnsi="Times New Roman" w:cs="Times New Roman"/>
+          <w:kern w:val="0"/>
+          <w:sz w:val="24"/>
+          <w:szCs w:val="24"/>
+          <w:lang w:eastAsia="ru-KZ"/>
+          <w14:ligatures w14:val="none"/>
+        </w:rPr>
+        <w:t>/</w:t>
+      </w:r>
+      <w:proofErr w:type="spellStart"/>
+      <w:r>
+        <w:rPr>
+          <w:rFonts w:ascii="Times New Roman" w:eastAsia="Times New Roman" w:hAnsi="Times New Roman" w:cs="Times New Roman"/>
+          <w:kern w:val="0"/>
+          <w:sz w:val="24"/>
+          <w:szCs w:val="24"/>
+          <w:lang w:eastAsia="ru-KZ"/>
+          <w14:ligatures w14:val="none"/>
+        </w:rPr>
+        <w:t>auth</w:t>
+      </w:r>
+      <w:proofErr w:type="spellEnd"/>
+      <w:r>
+        <w:rPr>
+          <w:rFonts w:ascii="Times New Roman" w:eastAsia="Times New Roman" w:hAnsi="Times New Roman" w:cs="Times New Roman"/>
+          <w:kern w:val="0"/>
+          <w:sz w:val="24"/>
+          <w:szCs w:val="24"/>
+          <w:lang w:eastAsia="ru-KZ"/>
+          <w14:ligatures w14:val="none"/>
+        </w:rPr>
+        <w:t>/</w:t>
+      </w:r>
+      <w:proofErr w:type="spellStart"/>
+      <w:r>
+        <w:rPr>
+          <w:rFonts w:ascii="Times New Roman" w:eastAsia="Times New Roman" w:hAnsi="Times New Roman" w:cs="Times New Roman"/>
+          <w:kern w:val="0"/>
+          <w:sz w:val="24"/>
+          <w:szCs w:val="24"/>
+          <w:lang w:eastAsia="ru-KZ"/>
+          <w14:ligatures w14:val="none"/>
+        </w:rPr>
+        <w:t>login</w:t>
+      </w:r>
+      <w:proofErr w:type="spellEnd"/>
+    </w:p>
+    <w:p>
+      <w:pPr>
+        <w:pStyle w:val="a7"/>
+        <w:numPr>
+          <w:ilvl w:val="0"/>
+          <w:numId w:val="8"/>
+        </w:numPr>
+        <w:rPr>
+          <w:rFonts w:ascii="Times New Roman" w:eastAsia="Times New Roman" w:hAnsi="Times New Roman" w:cs="Times New Roman"/>
+          <w:kern w:val="0"/>
+          <w:sz w:val="24"/>
+          <w:szCs w:val="24"/>
+          <w:lang w:eastAsia="ru-KZ"/>
+          <w14:ligatures w14:val="none"/>
+        </w:rPr>
+      </w:pPr>
+      <w:r>
+        <w:rPr>
+          <w:rFonts w:ascii="Times New Roman" w:eastAsia="Times New Roman" w:hAnsi="Times New Roman" w:cs="Times New Roman"/>
+          <w:kern w:val="0"/>
+          <w:sz w:val="24"/>
+          <w:szCs w:val="24"/>
+          <w:lang w:val="ru-RU" w:eastAsia="ru-KZ"/>
+          <w14:ligatures w14:val="none"/>
+        </w:rPr>
+        <w:t>Получение</w:t>
+      </w:r>
+      <w:r>
+        <w:rPr>
+          <w:rFonts w:ascii="Times New Roman" w:eastAsia="Times New Roman" w:hAnsi="Times New Roman" w:cs="Times New Roman"/>
+          <w:kern w:val="0"/>
+          <w:sz w:val="24"/>
+          <w:szCs w:val="24"/>
+          <w:lang w:val="en-US" w:eastAsia="ru-KZ"/>
+          <w14:ligatures w14:val="none"/>
+        </w:rPr>
+        <w:t xml:space="preserve"> </w:t>
+      </w:r>
+      <w:r>
+        <w:rPr>
+          <w:rFonts w:ascii="Times New Roman" w:eastAsia="Times New Roman" w:hAnsi="Times New Roman" w:cs="Times New Roman"/>
+          <w:kern w:val="0"/>
+          <w:sz w:val="24"/>
+          <w:szCs w:val="24"/>
+          <w:lang w:val="ru-RU" w:eastAsia="ru-KZ"/>
+          <w14:ligatures w14:val="none"/>
+        </w:rPr>
+        <w:t>нового</w:t>
+      </w:r>
+      <w:r>
+        <w:rPr>
+          <w:rFonts w:ascii="Times New Roman" w:eastAsia="Times New Roman" w:hAnsi="Times New Roman" w:cs="Times New Roman"/>
+          <w:kern w:val="0"/>
+          <w:sz w:val="24"/>
+          <w:szCs w:val="24"/>
+          <w:lang w:val="en-US" w:eastAsia="ru-KZ"/>
+          <w14:ligatures w14:val="none"/>
+        </w:rPr>
+        <w:t xml:space="preserve"> </w:t>
+      </w:r>
+      <w:r>
+        <w:rPr>
+          <w:rFonts w:ascii="Times New Roman" w:eastAsia="Times New Roman" w:hAnsi="Times New Roman" w:cs="Times New Roman"/>
+          <w:kern w:val="0"/>
+          <w:sz w:val="24"/>
+          <w:szCs w:val="24"/>
+          <w:lang w:val="en-US" w:eastAsia="ru-KZ"/>
+          <w14:ligatures w14:val="none"/>
+        </w:rPr>
+        <w:t>Access</w:t>
+      </w:r>
+      <w:r>
+        <w:rPr>
+          <w:rFonts w:ascii="Times New Roman" w:eastAsia="Times New Roman" w:hAnsi="Times New Roman" w:cs="Times New Roman"/>
+          <w:kern w:val="0"/>
+          <w:sz w:val="24"/>
+          <w:szCs w:val="24"/>
+          <w:lang w:val="en-US" w:eastAsia="ru-KZ"/>
+          <w14:ligatures w14:val="none"/>
+        </w:rPr>
+        <w:t xml:space="preserve"> </w:t>
+      </w:r>
+      <w:r>
+        <w:rPr>
+          <w:rFonts w:ascii="Times New Roman" w:eastAsia="Times New Roman" w:hAnsi="Times New Roman" w:cs="Times New Roman"/>
+          <w:kern w:val="0"/>
+          <w:sz w:val="24"/>
+          <w:szCs w:val="24"/>
+          <w:lang w:val="ru-RU" w:eastAsia="ru-KZ"/>
+          <w14:ligatures w14:val="none"/>
+        </w:rPr>
+        <w:t>токена</w:t>
+      </w:r>
+      <w:r>
+        <w:rPr>
+          <w:rFonts w:ascii="Times New Roman" w:eastAsia="Times New Roman" w:hAnsi="Times New Roman" w:cs="Times New Roman"/>
+          <w:kern w:val="0"/>
+          <w:sz w:val="24"/>
+          <w:szCs w:val="24"/>
+          <w:lang w:val="en-US" w:eastAsia="ru-KZ"/>
+          <w14:ligatures w14:val="none"/>
+        </w:rPr>
+        <w:t xml:space="preserve">: </w:t>
+      </w:r>
+      <w:r>
+        <w:rPr>
+          <w:rFonts w:ascii="Times New Roman" w:eastAsia="Times New Roman" w:hAnsi="Times New Roman" w:cs="Times New Roman"/>
+          <w:kern w:val="0"/>
+          <w:sz w:val="24"/>
+          <w:szCs w:val="24"/>
+          <w:lang w:eastAsia="ru-KZ"/>
+          <w14:ligatures w14:val="none"/>
+        </w:rPr>
+        <w:t>POST /</w:t>
+      </w:r>
+      <w:proofErr w:type="spellStart"/>
+      <w:r>
+        <w:rPr>
+          <w:rFonts w:ascii="Times New Roman" w:eastAsia="Times New Roman" w:hAnsi="Times New Roman" w:cs="Times New Roman"/>
+          <w:kern w:val="0"/>
+          <w:sz w:val="24"/>
+          <w:szCs w:val="24"/>
+          <w:lang w:eastAsia="ru-KZ"/>
+          <w14:ligatures w14:val="none"/>
+        </w:rPr>
+        <w:t>api</w:t>
+      </w:r>
+      <w:proofErr w:type="spellEnd"/>
+      <w:r>
+        <w:rPr>
+          <w:rFonts w:ascii="Times New Roman" w:eastAsia="Times New Roman" w:hAnsi="Times New Roman" w:cs="Times New Roman"/>
+          <w:kern w:val="0"/>
+          <w:sz w:val="24"/>
+          <w:szCs w:val="24"/>
+          <w:lang w:eastAsia="ru-KZ"/>
+          <w14:ligatures w14:val="none"/>
+        </w:rPr>
+        <w:t>/</w:t>
+      </w:r>
+      <w:proofErr w:type="spellStart"/>
+      <w:r>
+        <w:rPr>
+          <w:rFonts w:ascii="Times New Roman" w:eastAsia="Times New Roman" w:hAnsi="Times New Roman" w:cs="Times New Roman"/>
+          <w:kern w:val="0"/>
+          <w:sz w:val="24"/>
+          <w:szCs w:val="24"/>
+          <w:lang w:eastAsia="ru-KZ"/>
+          <w14:ligatures w14:val="none"/>
+        </w:rPr>
+        <w:t>auth</w:t>
+      </w:r>
+      <w:proofErr w:type="spellEnd"/>
+      <w:r>
+        <w:rPr>
+          <w:rFonts w:ascii="Times New Roman" w:eastAsia="Times New Roman" w:hAnsi="Times New Roman" w:cs="Times New Roman"/>
+          <w:kern w:val="0"/>
+          <w:sz w:val="24"/>
+          <w:szCs w:val="24"/>
+          <w:lang w:eastAsia="ru-KZ"/>
+          <w14:ligatures w14:val="none"/>
+        </w:rPr>
+        <w:t>/</w:t>
+      </w:r>
+      <w:proofErr w:type="spellStart"/>
+      <w:r>
+        <w:rPr>
+          <w:rFonts w:ascii="Times New Roman" w:eastAsia="Times New Roman" w:hAnsi="Times New Roman" w:cs="Times New Roman"/>
+          <w:kern w:val="0"/>
+          <w:sz w:val="24"/>
+          <w:szCs w:val="24"/>
+          <w:lang w:eastAsia="ru-KZ"/>
+          <w14:ligatures w14:val="none"/>
+        </w:rPr>
+        <w:t>refresh</w:t>
+      </w:r>
+      <w:proofErr w:type="spellEnd"/>
+    </w:p>
+    <w:p>
+      <w:pPr>
+        <w:pStyle w:val="a7"/>
+        <w:numPr>
+          <w:ilvl w:val="0"/>
+          <w:numId w:val="8"/>
+        </w:numPr>
+        <w:rPr>
+          <w:rFonts w:ascii="Times New Roman" w:hAnsi="Times New Roman" w:cs="Times New Roman"/>
+          <w:sz w:val="24"/>
+          <w:szCs w:val="24"/>
         </w:rPr>
       </w:pPr>
       <w:r>
@@ -529,10 +1743,65 @@
       </w:r>
       <w:r>
         <w:rPr>
-          <w:rFonts w:eastAsia="Times New Roman"/>
-          <w:lang w:val="ru-KZ"/>
-        </w:rPr>
-        <w:t>GET /api/download/{fileName}</w:t>
+          <w:rFonts w:ascii="Times New Roman" w:eastAsia="Times New Roman" w:hAnsi="Times New Roman" w:cs="Times New Roman"/>
+          <w:sz w:val="24"/>
+          <w:szCs w:val="24"/>
+        </w:rPr>
+        <w:t>GET /</w:t>
+      </w:r>
+      <w:proofErr w:type="spellStart"/>
+      <w:r>
+        <w:rPr>
+          <w:rFonts w:ascii="Times New Roman" w:eastAsia="Times New Roman" w:hAnsi="Times New Roman" w:cs="Times New Roman"/>
+          <w:sz w:val="24"/>
+          <w:szCs w:val="24"/>
+        </w:rPr>
+        <w:t>api</w:t>
+      </w:r>
+      <w:proofErr w:type="spellEnd"/>
+      <w:r>
+        <w:rPr>
+          <w:rFonts w:ascii="Times New Roman" w:eastAsia="Times New Roman" w:hAnsi="Times New Roman" w:cs="Times New Roman"/>
+          <w:sz w:val="24"/>
+          <w:szCs w:val="24"/>
+        </w:rPr>
+        <w:t>/</w:t>
+      </w:r>
+      <w:proofErr w:type="spellStart"/>
+      <w:r>
+        <w:rPr>
+          <w:rFonts w:ascii="Times New Roman" w:eastAsia="Times New Roman" w:hAnsi="Times New Roman" w:cs="Times New Roman"/>
+          <w:sz w:val="24"/>
+          <w:szCs w:val="24"/>
+        </w:rPr>
+        <w:t>download</w:t>
+      </w:r>
+      <w:proofErr w:type="spellEnd"/>
+      <w:r>
+        <w:rPr>
+          <w:rFonts w:ascii="Times New Roman" w:eastAsia="Times New Roman" w:hAnsi="Times New Roman" w:cs="Times New Roman"/>
+          <w:sz w:val="24"/>
+          <w:szCs w:val="24"/>
+        </w:rPr>
+        <w:t>/{</w:t>
+      </w:r>
+      <w:proofErr w:type="spellStart"/>
+      <w:r>
+        <w:rPr>
+          <w:rFonts w:ascii="Times New Roman" w:eastAsia="Times New Roman" w:hAnsi="Times New Roman" w:cs="Times New Roman"/>
+          <w:sz w:val="24"/>
+          <w:szCs w:val="24"/>
+        </w:rPr>
+        <w:t>fileName</w:t>
+      </w:r>
+      <w:proofErr w:type="spellEnd"/>
+      <w:r>
+        <w:rPr>
+          <w:rFonts w:ascii="Times New Roman" w:eastAsia="Times New Roman" w:hAnsi="Times New Roman" w:cs="Times New Roman"/>
+          <w:sz w:val="24"/>
+          <w:szCs w:val="24"/>
+        </w:rPr>
+        <w:t>}</w:t>
       </w:r>
     </w:p>
     <w:p>
@@ -595,14 +1864,52 @@
           <w:lang w:val="ru-RU"/>
         </w:rPr>
       </w:pPr>
+      <w:proofErr w:type="spellStart"/>
       <w:r>
         <w:rPr>
           <w:rFonts w:cstheme="minorHAnsi"/>
           <w:sz w:val="24"/>
           <w:szCs w:val="24"/>
         </w:rPr>
-        <w:t>docker logs pdf-check-service</w:t>
-      </w:r>
+        <w:t>docker</w:t>
+      </w:r>
+      <w:proofErr w:type="spellEnd"/>
+      <w:r>
+        <w:rPr>
+          <w:rFonts w:cstheme="minorHAnsi"/>
+          <w:sz w:val="24"/>
+          <w:szCs w:val="24"/>
+        </w:rPr>
+        <w:t xml:space="preserve"> </w:t>
+      </w:r>
+      <w:proofErr w:type="spellStart"/>
+      <w:r>
+        <w:rPr>
+          <w:rFonts w:cstheme="minorHAnsi"/>
+          <w:sz w:val="24"/>
+          <w:szCs w:val="24"/>
+        </w:rPr>
+        <w:t>logs</w:t>
+      </w:r>
+      <w:proofErr w:type="spellEnd"/>
+      <w:r>
+        <w:rPr>
+          <w:rFonts w:cstheme="minorHAnsi"/>
+          <w:sz w:val="24"/>
+          <w:szCs w:val="24"/>
+        </w:rPr>
+        <w:t xml:space="preserve"> </w:t>
+      </w:r>
+      <w:proofErr w:type="spellStart"/>
+      <w:r>
+        <w:rPr>
+          <w:rFonts w:cstheme="minorHAnsi"/>
+          <w:sz w:val="24"/>
+          <w:szCs w:val="24"/>
+        </w:rPr>
+        <w:t>pdf-check-service</w:t>
+      </w:r>
+      <w:proofErr w:type="spellEnd"/>
     </w:p>
     <w:p>
       <w:pPr>
@@ -619,7 +1926,43 @@
           <w:sz w:val="24"/>
           <w:szCs w:val="24"/>
         </w:rPr>
-        <w:t>Подозрительные файлы сохраняются внутри контейнера по пути /storage/suspicious/</w:t>
+        <w:t>Подозрительные файлы сохраняются внутри контейнера по пути /</w:t>
+      </w:r>
+      <w:proofErr w:type="spellStart"/>
+      <w:r>
+        <w:rPr>
+          <w:rFonts w:cstheme="minorHAnsi"/>
+          <w:sz w:val="24"/>
+          <w:szCs w:val="24"/>
+        </w:rPr>
+        <w:t>storage</w:t>
+      </w:r>
+      <w:proofErr w:type="spellEnd"/>
+      <w:r>
+        <w:rPr>
+          <w:rFonts w:cstheme="minorHAnsi"/>
+          <w:sz w:val="24"/>
+          <w:szCs w:val="24"/>
+        </w:rPr>
+        <w:t>/</w:t>
+      </w:r>
+      <w:proofErr w:type="spellStart"/>
+      <w:r>
+        <w:rPr>
+          <w:rFonts w:cstheme="minorHAnsi"/>
+          <w:sz w:val="24"/>
+          <w:szCs w:val="24"/>
+        </w:rPr>
+        <w:t>suspicious</w:t>
+      </w:r>
+      <w:proofErr w:type="spellEnd"/>
+      <w:r>
+        <w:rPr>
+          <w:rFonts w:cstheme="minorHAnsi"/>
+          <w:sz w:val="24"/>
+          <w:szCs w:val="24"/>
+        </w:rPr>
+        <w:t>/</w:t>
       </w:r>
       <w:r>
         <w:rPr>
@@ -645,23 +1988,107 @@
           <w:lang w:val="ru-RU"/>
         </w:rPr>
       </w:pPr>
+      <w:proofErr w:type="spellStart"/>
       <w:r>
         <w:rPr>
           <w:rFonts w:cstheme="minorHAnsi"/>
           <w:sz w:val="24"/>
           <w:szCs w:val="24"/>
         </w:rPr>
-        <w:t>docker cp pdf-check-service:/storage/suspicious/. C:\</w:t>
-      </w:r>
+        <w:t>docker</w:t>
+      </w:r>
+      <w:proofErr w:type="spellEnd"/>
       <w:r>
         <w:rPr>
           <w:rFonts w:cstheme="minorHAnsi"/>
           <w:sz w:val="24"/>
           <w:szCs w:val="24"/>
+        </w:rPr>
+        <w:t xml:space="preserve"> </w:t>
+      </w:r>
+      <w:proofErr w:type="spellStart"/>
+      <w:r>
+        <w:rPr>
+          <w:rFonts w:cstheme="minorHAnsi"/>
+          <w:sz w:val="24"/>
+          <w:szCs w:val="24"/>
+        </w:rPr>
+        <w:t>cp</w:t>
+      </w:r>
+      <w:proofErr w:type="spellEnd"/>
+      <w:r>
+        <w:rPr>
+          <w:rFonts w:cstheme="minorHAnsi"/>
+          <w:sz w:val="24"/>
+          <w:szCs w:val="24"/>
+        </w:rPr>
+        <w:t xml:space="preserve"> </w:t>
+      </w:r>
+      <w:proofErr w:type="spellStart"/>
+      <w:r>
+        <w:rPr>
+          <w:rFonts w:cstheme="minorHAnsi"/>
+          <w:sz w:val="24"/>
+          <w:szCs w:val="24"/>
+        </w:rPr>
+        <w:t>pdf-check-service</w:t>
+      </w:r>
+      <w:proofErr w:type="spellEnd"/>
+      <w:r>
+        <w:rPr>
+          <w:rFonts w:cstheme="minorHAnsi"/>
+          <w:sz w:val="24"/>
+          <w:szCs w:val="24"/>
+        </w:rPr>
+        <w:t>:/</w:t>
+      </w:r>
+      <w:proofErr w:type="spellStart"/>
+      <w:r>
+        <w:rPr>
+          <w:rFonts w:cstheme="minorHAnsi"/>
+          <w:sz w:val="24"/>
+          <w:szCs w:val="24"/>
+        </w:rPr>
+        <w:t>storage</w:t>
+      </w:r>
+      <w:proofErr w:type="spellEnd"/>
+      <w:r>
+        <w:rPr>
+          <w:rFonts w:cstheme="minorHAnsi"/>
+          <w:sz w:val="24"/>
+          <w:szCs w:val="24"/>
+        </w:rPr>
+        <w:t>/</w:t>
+      </w:r>
+      <w:proofErr w:type="spellStart"/>
+      <w:r>
+        <w:rPr>
+          <w:rFonts w:cstheme="minorHAnsi"/>
+          <w:sz w:val="24"/>
+          <w:szCs w:val="24"/>
+        </w:rPr>
+        <w:t>suspicious</w:t>
+      </w:r>
+      <w:proofErr w:type="spellEnd"/>
+      <w:r>
+        <w:rPr>
+          <w:rFonts w:cstheme="minorHAnsi"/>
+          <w:sz w:val="24"/>
+          <w:szCs w:val="24"/>
+        </w:rPr>
+        <w:t>/. C:\</w:t>
+      </w:r>
+      <w:proofErr w:type="spellStart"/>
+      <w:r>
+        <w:rPr>
+          <w:rFonts w:cstheme="minorHAnsi"/>
+          <w:sz w:val="24"/>
+          <w:szCs w:val="24"/>
           <w:lang w:val="ru-RU"/>
         </w:rPr>
         <w:t>ваш_путь</w:t>
       </w:r>
+      <w:proofErr w:type="spellEnd"/>
     </w:p>
     <w:p>
       <w:pPr>
@@ -687,7 +2114,43 @@
           <w:sz w:val="24"/>
           <w:szCs w:val="24"/>
         </w:rPr>
-        <w:t>/storage/suspicious/</w:t>
+        <w:t>/</w:t>
+      </w:r>
+      <w:proofErr w:type="spellStart"/>
+      <w:r>
+        <w:rPr>
+          <w:rFonts w:cstheme="minorHAnsi"/>
+          <w:sz w:val="24"/>
+          <w:szCs w:val="24"/>
+        </w:rPr>
+        <w:t>storage</w:t>
+      </w:r>
+      <w:proofErr w:type="spellEnd"/>
+      <w:r>
+        <w:rPr>
+          <w:rFonts w:cstheme="minorHAnsi"/>
+          <w:sz w:val="24"/>
+          <w:szCs w:val="24"/>
+        </w:rPr>
+        <w:t>/</w:t>
+      </w:r>
+      <w:proofErr w:type="spellStart"/>
+      <w:r>
+        <w:rPr>
+          <w:rFonts w:cstheme="minorHAnsi"/>
+          <w:sz w:val="24"/>
+          <w:szCs w:val="24"/>
+        </w:rPr>
+        <w:t>suspicious</w:t>
+      </w:r>
+      <w:proofErr w:type="spellEnd"/>
+      <w:r>
+        <w:rPr>
+          <w:rFonts w:cstheme="minorHAnsi"/>
+          <w:sz w:val="24"/>
+          <w:szCs w:val="24"/>
+        </w:rPr>
+        <w:t>/</w:t>
       </w:r>
     </w:p>
     <w:p>
@@ -714,7 +2177,43 @@
           <w:sz w:val="24"/>
           <w:szCs w:val="24"/>
         </w:rPr>
-        <w:t>/storage/clean/</w:t>
+        <w:t>/</w:t>
+      </w:r>
+      <w:proofErr w:type="spellStart"/>
+      <w:r>
+        <w:rPr>
+          <w:rFonts w:cstheme="minorHAnsi"/>
+          <w:sz w:val="24"/>
+          <w:szCs w:val="24"/>
+        </w:rPr>
+        <w:t>storage</w:t>
+      </w:r>
+      <w:proofErr w:type="spellEnd"/>
+      <w:r>
+        <w:rPr>
+          <w:rFonts w:cstheme="minorHAnsi"/>
+          <w:sz w:val="24"/>
+          <w:szCs w:val="24"/>
+        </w:rPr>
+        <w:t>/</w:t>
+      </w:r>
+      <w:proofErr w:type="spellStart"/>
+      <w:r>
+        <w:rPr>
+          <w:rFonts w:cstheme="minorHAnsi"/>
+          <w:sz w:val="24"/>
+          <w:szCs w:val="24"/>
+        </w:rPr>
+        <w:t>clean</w:t>
+      </w:r>
+      <w:proofErr w:type="spellEnd"/>
+      <w:r>
+        <w:rPr>
+          <w:rFonts w:cstheme="minorHAnsi"/>
+          <w:sz w:val="24"/>
+          <w:szCs w:val="24"/>
+        </w:rPr>
+        <w:t>/</w:t>
       </w:r>
     </w:p>
     <w:sectPr>
@@ -3074,4 +4573,16 @@
     </a:ext>
   </a:extLst>
 </a:theme>
+</file>
+
+<file path=customXml/item1.xml><?xml version="1.0" encoding="utf-8"?>
+<b:Sources xmlns:b="http://schemas.openxmlformats.org/officeDocument/2006/bibliography" xmlns="http://schemas.openxmlformats.org/officeDocument/2006/bibliography" SelectedStyle="\APASixthEditionOfficeOnline.xsl" StyleName="APA" Version="6"/>
+</file>
+
+<file path=customXml/itemProps1.xml><?xml version="1.0" encoding="utf-8"?>
+<ds:datastoreItem xmlns:ds="http://schemas.openxmlformats.org/officeDocument/2006/customXml" ds:itemID="{D947F218-055E-4B92-B2DA-E9BE5217CEDE}">
+  <ds:schemaRefs>
+    <ds:schemaRef ds:uri="http://schemas.openxmlformats.org/officeDocument/2006/bibliography"/>
+  </ds:schemaRefs>
+</ds:datastoreItem>
 </file>
</xml_diff>